<commit_message>
Exp. Estadística Interpretación n3 v1: actualiza Rmd, regen. HTML/DOCX; mejoras en SemilleroCloze.R; agrega docs y materiales
- Modifica Rmd principal con correcciones de contenido/formato.

- Regenera salidas HTML y DOCX asociadas al Rmd.

- Ajustes en SemilleroCloze.R para mejorar claridad y flujo de generación.

- Agrega documentación unificada (Gemini/Gem) en Auxiliares/rules_full (.html y .md).

- Incorpora carpeta Lab-Manjaro/13-S1-2024B con Rmd, HTML, PDF, TEX, LOG y PNGs de apoyo.

- Añade salida_hibrida/info_sesion.rds para trazabilidad de sesión.

- Objetivo: consolidar materiales y mantener versiones renderizadas junto a sus fuentes.
</commit_message>
<xml_diff>
--- a/Lab-Manjaro/ExportacionesGraficosEstadisticaInterpretacion_n3_v1/ExportacionesGraficosEstadisticaInterpretacion_n3_cloze_v1.docx
+++ b/Lab-Manjaro/ExportacionesGraficosEstadisticaInterpretacion_n3_v1/ExportacionesGraficosEstadisticaInterpretacion_n3_cloze_v1.docx
@@ -48,12 +48,6 @@
           </wp:inline>
         </w:drawing>
       </w:r>
-      <w:r>
-        <w:br/>
-      </w:r>
-      <w:r>
-        <w:br/>
-      </w:r>
     </w:p>
     <w:p>
       <w:pPr>
@@ -101,9 +95,6 @@
           </wp:inline>
         </w:drawing>
       </w:r>
-      <w:r>
-        <w:br/>
-      </w:r>
     </w:p>
     <w:bookmarkStart w:id="34" w:name="question"/>
     <w:p>
@@ -145,7 +136,7 @@
         <w:pStyle w:val="BodyText"/>
       </w:pPr>
       <w:r>
-        <w:t xml:space="preserve">Para determinar el valor específico de lana exportado desde Tebailandia en 1963, resuelva paso a paso combinando información de ambos gráficos:</w:t>
+        <w:t xml:space="preserve">Para determinar el valor específico de tomates exportado desde Tebailandia en 2005, resuelva paso a paso combinando información de ambos gráficos:</w:t>
       </w:r>
     </w:p>
     <w:p>
@@ -236,7 +227,7 @@
         <w:pStyle w:val="FirstParagraph"/>
       </w:pPr>
       <w:r>
-        <w:t xml:space="preserve">Observe el primer gráfico. ¿Cuál fue el valor total de exportaciones de Tebailandia en 1963?</w:t>
+        <w:t xml:space="preserve">Observe el primer gráfico. ¿Cuál fue el valor total de exportaciones de Tebailandia en 2005?</w:t>
       </w:r>
     </w:p>
     <w:p>
@@ -272,7 +263,7 @@
         <w:pStyle w:val="FirstParagraph"/>
       </w:pPr>
       <w:r>
-        <w:t xml:space="preserve">Observe el segundo gráfico. ¿Qué porcentaje del total de exportaciones corresponde a lana en 1963?</w:t>
+        <w:t xml:space="preserve">Observe el segundo gráfico. ¿Qué porcentaje del total de exportaciones corresponde a tomates en 2005?</w:t>
       </w:r>
     </w:p>
     <w:p>
@@ -294,13 +285,13 @@
       </w:r>
     </w:p>
     <w:bookmarkEnd w:id="27"/>
-    <w:bookmarkStart w:id="28" w:name="Xeb8f361aaaf23a994983e1de5e3bc8e9c35c6e3"/>
+    <w:bookmarkStart w:id="28" w:name="paso-3-configuración-de-la-fórmula"/>
     <w:p>
       <w:pPr>
         <w:pStyle w:val="Heading3"/>
       </w:pPr>
       <w:r>
-        <w:t xml:space="preserve">Paso 3: Configuración de la fórmula (numerador)</w:t>
+        <w:t xml:space="preserve">Paso 3: Configuración de la fórmula</w:t>
       </w:r>
     </w:p>
     <w:p>
@@ -308,7 +299,7 @@
         <w:pStyle w:val="FirstParagraph"/>
       </w:pPr>
       <w:r>
-        <w:t xml:space="preserve">Para calcular el valor de lana, complete la fórmula con el valor total identificado:</w:t>
+        <w:t xml:space="preserve">Para calcular el valor de tomates, identifique los componentes de la fórmula:</w:t>
       </w:r>
     </w:p>
     <w:p>
@@ -316,7 +307,15 @@
         <w:pStyle w:val="BodyText"/>
       </w:pPr>
       <w:r>
-        <w:t xml:space="preserve">Valor de lana = ##ANSWER3## × (porcentaje ÷ 100)</w:t>
+        <w:t xml:space="preserve">Valor de tomates = Valor total × (##ANSWER2##% ÷ 100)</w:t>
+      </w:r>
+    </w:p>
+    <w:p>
+      <w:pPr>
+        <w:pStyle w:val="BodyText"/>
+      </w:pPr>
+      <w:r>
+        <w:t xml:space="preserve">Confirme el valor total a usar: ##ANSWER3## millones de tebos</w:t>
       </w:r>
     </w:p>
     <w:bookmarkEnd w:id="28"/>
@@ -386,7 +385,7 @@
         <w:pStyle w:val="FirstParagraph"/>
       </w:pPr>
       <w:r>
-        <w:t xml:space="preserve">Por lo tanto, el valor de lana exportado en 1963 es:</w:t>
+        <w:t xml:space="preserve">Por lo tanto, el valor de tomates exportado en 2005 es:</w:t>
       </w:r>
     </w:p>
     <w:p>
@@ -452,7 +451,7 @@
         </w:numPr>
       </w:pPr>
       <w:r>
-        <w:t xml:space="preserve">Sumar el valor total de exportaciones de 1963 con el porcentaje de lana.</w:t>
+        <w:t xml:space="preserve">Multiplicar el porcentaje de tomates por 100 y dividir entre el valor total de exportaciones.</w:t>
       </w:r>
     </w:p>
     <w:p>
@@ -464,7 +463,7 @@
         </w:numPr>
       </w:pPr>
       <w:r>
-        <w:t xml:space="preserve">Multiplicar el porcentaje de lana por 100 y dividir entre el valor total de exportaciones.</w:t>
+        <w:t xml:space="preserve">Dividir el porcentaje de tomates entre el valor total de exportaciones de 2005.</w:t>
       </w:r>
     </w:p>
     <w:p>
@@ -476,7 +475,7 @@
         </w:numPr>
       </w:pPr>
       <w:r>
-        <w:t xml:space="preserve">Multiplicar el valor total de exportaciones de 1963 por el porcentaje de lana expresado en forma decimal.</w:t>
+        <w:t xml:space="preserve">Sumar el valor total de exportaciones de 2005 con el porcentaje de tomates.</w:t>
       </w:r>
     </w:p>
     <w:p>
@@ -488,7 +487,7 @@
         </w:numPr>
       </w:pPr>
       <w:r>
-        <w:t xml:space="preserve">Dividir el porcentaje de lana entre el valor total de exportaciones de 1963.</w:t>
+        <w:t xml:space="preserve">Aplicar la fórmula: Valor del producto = Valor total × (45 ÷ 100).</w:t>
       </w:r>
     </w:p>
     <w:bookmarkEnd w:id="33"/>
@@ -653,7 +652,7 @@
         <w:t xml:space="preserve"> </w:t>
       </w:r>
       <w:r>
-        <w:t xml:space="preserve">65.2 millones de tebos</w:t>
+        <w:t xml:space="preserve">68.1 millones de tebos</w:t>
       </w:r>
     </w:p>
     <w:p>
@@ -671,7 +670,7 @@
         <w:t xml:space="preserve"> </w:t>
       </w:r>
       <w:r>
-        <w:t xml:space="preserve">La lectura cuidadosa del gráfico de barras muestra que en 1963 las exportaciones totales de Tebailandia fueron exactamente 65.2 millones de tebos.</w:t>
+        <w:t xml:space="preserve">La lectura cuidadosa del gráfico de barras muestra que en 2005 las exportaciones totales de Tebailandia fueron exactamente 68.1 millones de tebos.</w:t>
       </w:r>
     </w:p>
     <w:p>
@@ -695,7 +694,7 @@
         </w:numPr>
       </w:pPr>
       <w:r>
-        <w:t xml:space="preserve">Año 1962: 13.5 millones de tebos</w:t>
+        <w:t xml:space="preserve">Año 2001: 10.7 millones de tebos</w:t>
       </w:r>
     </w:p>
     <w:p>
@@ -707,7 +706,43 @@
         </w:numPr>
       </w:pPr>
       <w:r>
-        <w:t xml:space="preserve">Año 1963: 65.2 millones de tebos ←</w:t>
+        <w:t xml:space="preserve">Año 2002: 35.7 millones de tebos</w:t>
+      </w:r>
+    </w:p>
+    <w:p>
+      <w:pPr>
+        <w:pStyle w:val="Compact"/>
+        <w:numPr>
+          <w:ilvl w:val="0"/>
+          <w:numId w:val="1008"/>
+        </w:numPr>
+      </w:pPr>
+      <w:r>
+        <w:t xml:space="preserve">Año 2003: 40.8 millones de tebos</w:t>
+      </w:r>
+    </w:p>
+    <w:p>
+      <w:pPr>
+        <w:pStyle w:val="Compact"/>
+        <w:numPr>
+          <w:ilvl w:val="0"/>
+          <w:numId w:val="1008"/>
+        </w:numPr>
+      </w:pPr>
+      <w:r>
+        <w:t xml:space="preserve">Año 2004: 47.9 millones de tebos</w:t>
+      </w:r>
+    </w:p>
+    <w:p>
+      <w:pPr>
+        <w:pStyle w:val="Compact"/>
+        <w:numPr>
+          <w:ilvl w:val="0"/>
+          <w:numId w:val="1008"/>
+        </w:numPr>
+      </w:pPr>
+      <w:r>
+        <w:t xml:space="preserve">Año 2005: 68.1 millones de tebos ←</w:t>
       </w:r>
       <w:r>
         <w:t xml:space="preserve"> </w:t>
@@ -718,42 +753,6 @@
           <w:bCs/>
         </w:rPr>
         <w:t xml:space="preserve">AÑO DE LA PREGUNTA</w:t>
-      </w:r>
-    </w:p>
-    <w:p>
-      <w:pPr>
-        <w:pStyle w:val="Compact"/>
-        <w:numPr>
-          <w:ilvl w:val="0"/>
-          <w:numId w:val="1008"/>
-        </w:numPr>
-      </w:pPr>
-      <w:r>
-        <w:t xml:space="preserve">Año 1964: 69.9 millones de tebos</w:t>
-      </w:r>
-    </w:p>
-    <w:p>
-      <w:pPr>
-        <w:pStyle w:val="Compact"/>
-        <w:numPr>
-          <w:ilvl w:val="0"/>
-          <w:numId w:val="1008"/>
-        </w:numPr>
-      </w:pPr>
-      <w:r>
-        <w:t xml:space="preserve">Año 1965: 86.6 millones de tebos</w:t>
-      </w:r>
-    </w:p>
-    <w:p>
-      <w:pPr>
-        <w:pStyle w:val="Compact"/>
-        <w:numPr>
-          <w:ilvl w:val="0"/>
-          <w:numId w:val="1008"/>
-        </w:numPr>
-      </w:pPr>
-      <w:r>
-        <w:t xml:space="preserve">Año 1966: 87.1 millones de tebos</w:t>
       </w:r>
     </w:p>
     <w:bookmarkEnd w:id="36"/>
@@ -781,7 +780,7 @@
         <w:t xml:space="preserve"> </w:t>
       </w:r>
       <w:r>
-        <w:t xml:space="preserve">7%</w:t>
+        <w:t xml:space="preserve">45%</w:t>
       </w:r>
     </w:p>
     <w:p>
@@ -799,7 +798,7 @@
         <w:t xml:space="preserve"> </w:t>
       </w:r>
       <w:r>
-        <w:t xml:space="preserve">El gráfico circular muestra que lana representa exactamente el 7% del total de exportaciones en 1963.</w:t>
+        <w:t xml:space="preserve">El gráfico circular muestra que tomates representa exactamente el 45% del total de exportaciones en 2005.</w:t>
       </w:r>
     </w:p>
     <w:p>
@@ -823,7 +822,7 @@
         </w:numPr>
       </w:pPr>
       <w:r>
-        <w:t xml:space="preserve">lana: 7% ←</w:t>
+        <w:t xml:space="preserve">tomates: 45% ←</w:t>
       </w:r>
       <w:r>
         <w:t xml:space="preserve"> </w:t>
@@ -845,7 +844,7 @@
         </w:numPr>
       </w:pPr>
       <w:r>
-        <w:t xml:space="preserve">leche: 10%</w:t>
+        <w:t xml:space="preserve">tabaco: 7%</w:t>
       </w:r>
     </w:p>
     <w:p>
@@ -857,7 +856,7 @@
         </w:numPr>
       </w:pPr>
       <w:r>
-        <w:t xml:space="preserve">azúcar: 6%</w:t>
+        <w:t xml:space="preserve">uvas: 6%</w:t>
       </w:r>
     </w:p>
     <w:p>
@@ -869,7 +868,7 @@
         </w:numPr>
       </w:pPr>
       <w:r>
-        <w:t xml:space="preserve">pimientos: 9%</w:t>
+        <w:t xml:space="preserve">aves de corral: 5%</w:t>
       </w:r>
     </w:p>
     <w:p>
@@ -881,6 +880,18 @@
         </w:numPr>
       </w:pPr>
       <w:r>
+        <w:t xml:space="preserve">trigo: 5%</w:t>
+      </w:r>
+    </w:p>
+    <w:p>
+      <w:pPr>
+        <w:pStyle w:val="Compact"/>
+        <w:numPr>
+          <w:ilvl w:val="0"/>
+          <w:numId w:val="1009"/>
+        </w:numPr>
+      </w:pPr>
+      <w:r>
         <w:t xml:space="preserve">celulares: 5%</w:t>
       </w:r>
     </w:p>
@@ -893,7 +904,7 @@
         </w:numPr>
       </w:pPr>
       <w:r>
-        <w:t xml:space="preserve">sorgo: 5%</w:t>
+        <w:t xml:space="preserve">lana: 22%</w:t>
       </w:r>
     </w:p>
     <w:p>
@@ -905,19 +916,7 @@
         </w:numPr>
       </w:pPr>
       <w:r>
-        <w:t xml:space="preserve">tomates: 12%</w:t>
-      </w:r>
-    </w:p>
-    <w:p>
-      <w:pPr>
-        <w:pStyle w:val="Compact"/>
-        <w:numPr>
-          <w:ilvl w:val="0"/>
-          <w:numId w:val="1009"/>
-        </w:numPr>
-      </w:pPr>
-      <w:r>
-        <w:t xml:space="preserve">ajo: 46%</w:t>
+        <w:t xml:space="preserve">limones: 5%</w:t>
       </w:r>
     </w:p>
     <w:bookmarkEnd w:id="37"/>
@@ -945,7 +944,7 @@
         <w:t xml:space="preserve"> </w:t>
       </w:r>
       <w:r>
-        <w:t xml:space="preserve">65.2</w:t>
+        <w:t xml:space="preserve">68.1</w:t>
       </w:r>
     </w:p>
     <w:p>
@@ -963,7 +962,7 @@
         <w:t xml:space="preserve"> </w:t>
       </w:r>
       <w:r>
-        <w:t xml:space="preserve">Para calcular el valor de lana, necesitamos usar el valor total de exportaciones identificado en el Paso 1 como numerador de la fórmula.</w:t>
+        <w:t xml:space="preserve">Para calcular el valor de tomates, necesitamos usar el valor total de exportaciones identificado en el Paso 1 como numerador de la fórmula.</w:t>
       </w:r>
     </w:p>
     <w:bookmarkEnd w:id="38"/>
@@ -991,7 +990,7 @@
         <w:t xml:space="preserve"> </w:t>
       </w:r>
       <w:r>
-        <w:t xml:space="preserve">0.0700</w:t>
+        <w:t xml:space="preserve">0.4500</w:t>
       </w:r>
     </w:p>
     <w:p>
@@ -1015,7 +1014,7 @@
         <w:t xml:space="preserve"> </w:t>
       </w:r>
       <w:r>
-        <w:t xml:space="preserve">7% ÷ 100 = 0.0700</w:t>
+        <w:t xml:space="preserve">45% ÷ 100 = 0.4500</w:t>
       </w:r>
     </w:p>
     <w:bookmarkEnd w:id="39"/>
@@ -1043,7 +1042,7 @@
         <w:t xml:space="preserve"> </w:t>
       </w:r>
       <w:r>
-        <w:t xml:space="preserve">4.56</w:t>
+        <w:t xml:space="preserve">30.65</w:t>
       </w:r>
     </w:p>
     <w:p>
@@ -1061,7 +1060,7 @@
         <w:t xml:space="preserve"> </w:t>
       </w:r>
       <w:r>
-        <w:t xml:space="preserve">65.2 × 0.0700 = 4.56</w:t>
+        <w:t xml:space="preserve">68.1 × 0.4500 = 30.65</w:t>
       </w:r>
     </w:p>
     <w:bookmarkEnd w:id="40"/>
@@ -1089,7 +1088,7 @@
         <w:t xml:space="preserve"> </w:t>
       </w:r>
       <w:r>
-        <w:t xml:space="preserve">4.56 millones de tebos</w:t>
+        <w:t xml:space="preserve">30.64 millones de tebos</w:t>
       </w:r>
     </w:p>
     <w:p>
@@ -1103,17 +1102,29 @@
         </w:rPr>
         <w:t xml:space="preserve">Verificación del resultado:</w:t>
       </w:r>
-      <w:r>
-        <w:t xml:space="preserve"> </w:t>
-      </w:r>
-      <w:r>
-        <w:t xml:space="preserve">- El resultado (4.56 millones) es menor que el total (65.2 millones), lo cual es lógico ya que representa solo una fracción del total.</w:t>
-      </w:r>
-      <w:r>
-        <w:t xml:space="preserve"> </w:t>
-      </w:r>
-      <w:r>
-        <w:t xml:space="preserve">- El cálculo es coherente con la fórmula: Valor total × Porcentaje en decimal = Resultado final</w:t>
+    </w:p>
+    <w:p>
+      <w:pPr>
+        <w:pStyle w:val="Compact"/>
+        <w:numPr>
+          <w:ilvl w:val="0"/>
+          <w:numId w:val="1010"/>
+        </w:numPr>
+      </w:pPr>
+      <w:r>
+        <w:t xml:space="preserve">El resultado (30.64 millones) es menor que el total (68.1 millones), lo cual es lógico ya que representa solo una fracción del total.</w:t>
+      </w:r>
+    </w:p>
+    <w:p>
+      <w:pPr>
+        <w:pStyle w:val="Compact"/>
+        <w:numPr>
+          <w:ilvl w:val="0"/>
+          <w:numId w:val="1010"/>
+        </w:numPr>
+      </w:pPr>
+      <w:r>
+        <w:t xml:space="preserve">El cálculo es coherente con la fórmula: Valor total × Porcentaje en decimal = Resultado final</w:t>
       </w:r>
     </w:p>
     <w:bookmarkEnd w:id="41"/>
@@ -1143,7 +1154,7 @@
         <w:pStyle w:val="Compact"/>
         <w:numPr>
           <w:ilvl w:val="0"/>
-          <w:numId w:val="1010"/>
+          <w:numId w:val="1011"/>
         </w:numPr>
       </w:pPr>
       <w:r>
@@ -1154,15 +1165,15 @@
         <w:t xml:space="preserve">A</w:t>
       </w:r>
       <w:r>
-        <w:t xml:space="preserve">: Sumar el valor total de exportaciones de 1963 con el porcentaje de lana.</w:t>
-      </w:r>
-    </w:p>
-    <w:p>
-      <w:pPr>
-        <w:pStyle w:val="Compact"/>
-        <w:numPr>
-          <w:ilvl w:val="0"/>
-          <w:numId w:val="1010"/>
+        <w:t xml:space="preserve">: Multiplicar el porcentaje de tomates por 100 y dividir entre el valor total de exportaciones.</w:t>
+      </w:r>
+    </w:p>
+    <w:p>
+      <w:pPr>
+        <w:pStyle w:val="Compact"/>
+        <w:numPr>
+          <w:ilvl w:val="0"/>
+          <w:numId w:val="1011"/>
         </w:numPr>
       </w:pPr>
       <w:r>
@@ -1173,15 +1184,15 @@
         <w:t xml:space="preserve">B</w:t>
       </w:r>
       <w:r>
-        <w:t xml:space="preserve">: Multiplicar el porcentaje de lana por 100 y dividir entre el valor total de exportaciones.</w:t>
-      </w:r>
-    </w:p>
-    <w:p>
-      <w:pPr>
-        <w:pStyle w:val="Compact"/>
-        <w:numPr>
-          <w:ilvl w:val="0"/>
-          <w:numId w:val="1010"/>
+        <w:t xml:space="preserve">: Dividir el porcentaje de tomates entre el valor total de exportaciones de 2005.</w:t>
+      </w:r>
+    </w:p>
+    <w:p>
+      <w:pPr>
+        <w:pStyle w:val="Compact"/>
+        <w:numPr>
+          <w:ilvl w:val="0"/>
+          <w:numId w:val="1011"/>
         </w:numPr>
       </w:pPr>
       <w:r>
@@ -1192,7 +1203,26 @@
         <w:t xml:space="preserve">C</w:t>
       </w:r>
       <w:r>
-        <w:t xml:space="preserve">: Multiplicar el valor total de exportaciones de 1963 por el porcentaje de lana expresado en forma decimal. ←</w:t>
+        <w:t xml:space="preserve">: Sumar el valor total de exportaciones de 2005 con el porcentaje de tomates.</w:t>
+      </w:r>
+    </w:p>
+    <w:p>
+      <w:pPr>
+        <w:pStyle w:val="Compact"/>
+        <w:numPr>
+          <w:ilvl w:val="0"/>
+          <w:numId w:val="1011"/>
+        </w:numPr>
+      </w:pPr>
+      <w:r>
+        <w:rPr>
+          <w:b/>
+          <w:bCs/>
+        </w:rPr>
+        <w:t xml:space="preserve">D</w:t>
+      </w:r>
+      <w:r>
+        <w:t xml:space="preserve">: Aplicar la fórmula: Valor del producto = Valor total × (45 ÷ 100). ←</w:t>
       </w:r>
       <w:r>
         <w:t xml:space="preserve"> </w:t>
@@ -1207,25 +1237,6 @@
     </w:p>
     <w:p>
       <w:pPr>
-        <w:pStyle w:val="Compact"/>
-        <w:numPr>
-          <w:ilvl w:val="0"/>
-          <w:numId w:val="1010"/>
-        </w:numPr>
-      </w:pPr>
-      <w:r>
-        <w:rPr>
-          <w:b/>
-          <w:bCs/>
-        </w:rPr>
-        <w:t xml:space="preserve">D</w:t>
-      </w:r>
-      <w:r>
-        <w:t xml:space="preserve">: Dividir el porcentaje de lana entre el valor total de exportaciones de 1963.</w:t>
-      </w:r>
-    </w:p>
-    <w:p>
-      <w:pPr>
         <w:pStyle w:val="FirstParagraph"/>
       </w:pPr>
       <w:r>
@@ -1244,7 +1255,7 @@
         <w:t xml:space="preserve">“</w:t>
       </w:r>
       <w:r>
-        <w:t xml:space="preserve">Multiplicar el valor total de exportaciones de 1963 por el porcentaje de lana expresado en forma decimal.</w:t>
+        <w:t xml:space="preserve">Aplicar la fórmula: Valor del producto = Valor total × (45 ÷ 100).</w:t>
       </w:r>
       <w:r>
         <w:t xml:space="preserve">”</w:t>
@@ -1255,7 +1266,7 @@
         <w:pStyle w:val="Compact"/>
         <w:numPr>
           <w:ilvl w:val="0"/>
-          <w:numId w:val="1011"/>
+          <w:numId w:val="1012"/>
         </w:numPr>
       </w:pPr>
       <w:r>
@@ -1267,7 +1278,7 @@
         <w:pStyle w:val="Compact"/>
         <w:numPr>
           <w:ilvl w:val="0"/>
-          <w:numId w:val="1011"/>
+          <w:numId w:val="1012"/>
         </w:numPr>
       </w:pPr>
       <w:r>
@@ -1279,7 +1290,7 @@
         <w:pStyle w:val="Compact"/>
         <w:numPr>
           <w:ilvl w:val="0"/>
-          <w:numId w:val="1011"/>
+          <w:numId w:val="1012"/>
         </w:numPr>
       </w:pPr>
       <w:r>
@@ -1307,29 +1318,65 @@
         </w:rPr>
         <w:t xml:space="preserve">Datos del problema:</w:t>
       </w:r>
-      <w:r>
-        <w:t xml:space="preserve"> </w:t>
-      </w:r>
-      <w:r>
-        <w:t xml:space="preserve">- Valor total de exportaciones en 1963: 65.2 millones de tebos</w:t>
-      </w:r>
-      <w:r>
-        <w:t xml:space="preserve"> </w:t>
-      </w:r>
-      <w:r>
-        <w:t xml:space="preserve">- Porcentaje de lana: 7%</w:t>
-      </w:r>
-      <w:r>
-        <w:t xml:space="preserve"> </w:t>
-      </w:r>
-      <w:r>
-        <w:t xml:space="preserve">- Porcentaje en decimal: 0.0700</w:t>
-      </w:r>
-      <w:r>
-        <w:t xml:space="preserve"> </w:t>
-      </w:r>
-      <w:r>
-        <w:t xml:space="preserve">- Valor final de lana: 4.56 millones de tebos</w:t>
+    </w:p>
+    <w:p>
+      <w:pPr>
+        <w:pStyle w:val="Compact"/>
+        <w:numPr>
+          <w:ilvl w:val="0"/>
+          <w:numId w:val="1013"/>
+        </w:numPr>
+      </w:pPr>
+      <w:r>
+        <w:t xml:space="preserve">Valor total de exportaciones en 2005: 68.1 millones de tebos</w:t>
+      </w:r>
+    </w:p>
+    <w:p>
+      <w:pPr>
+        <w:pStyle w:val="Compact"/>
+        <w:numPr>
+          <w:ilvl w:val="0"/>
+          <w:numId w:val="1013"/>
+        </w:numPr>
+      </w:pPr>
+      <w:r>
+        <w:t xml:space="preserve">Porcentaje de tomates: 45%</w:t>
+      </w:r>
+    </w:p>
+    <w:p>
+      <w:pPr>
+        <w:pStyle w:val="Compact"/>
+        <w:numPr>
+          <w:ilvl w:val="0"/>
+          <w:numId w:val="1013"/>
+        </w:numPr>
+      </w:pPr>
+      <w:r>
+        <w:t xml:space="preserve">Porcentaje en decimal: 0.4500</w:t>
+      </w:r>
+    </w:p>
+    <w:p>
+      <w:pPr>
+        <w:pStyle w:val="Compact"/>
+        <w:numPr>
+          <w:ilvl w:val="0"/>
+          <w:numId w:val="1013"/>
+        </w:numPr>
+      </w:pPr>
+      <w:r>
+        <w:t xml:space="preserve">Valor final de tomates: 30.64 millones de tebos</w:t>
+      </w:r>
+    </w:p>
+    <w:p>
+      <w:pPr>
+        <w:pStyle w:val="FirstParagraph"/>
+      </w:pPr>
+      <w:r>
+        <w:rPr>
+          <w:b/>
+          <w:bCs/>
+        </w:rPr>
+        <w:t xml:space="preserve">El formato cloze con confirmación garantiza que los estudiantes:</w:t>
       </w:r>
     </w:p>
     <w:p>
@@ -1341,29 +1388,17 @@
           <w:b/>
           <w:bCs/>
         </w:rPr>
-        <w:t xml:space="preserve">El formato cloze con confirmación garantiza que los estudiantes:</w:t>
-      </w:r>
-    </w:p>
-    <w:p>
-      <w:pPr>
-        <w:pStyle w:val="BodyText"/>
-      </w:pPr>
-      <w:r>
-        <w:rPr>
-          <w:b/>
-          <w:bCs/>
-        </w:rPr>
         <w:t xml:space="preserve">Parte Analítica (Pasos 1-6):</w:t>
       </w:r>
-      <w:r>
-        <w:t xml:space="preserve"> </w:t>
-      </w:r>
-      <w:r>
-        <w:t xml:space="preserve">-</w:t>
-      </w:r>
-      <w:r>
-        <w:t xml:space="preserve"> </w:t>
-      </w:r>
+    </w:p>
+    <w:p>
+      <w:pPr>
+        <w:pStyle w:val="Compact"/>
+        <w:numPr>
+          <w:ilvl w:val="0"/>
+          <w:numId w:val="1014"/>
+        </w:numPr>
+      </w:pPr>
       <w:r>
         <w:rPr>
           <w:b/>
@@ -1377,15 +1412,15 @@
       <w:r>
         <w:t xml:space="preserve">ambos tipos de gráficos estadísticos</w:t>
       </w:r>
-      <w:r>
-        <w:t xml:space="preserve"> </w:t>
-      </w:r>
-      <w:r>
-        <w:t xml:space="preserve">-</w:t>
-      </w:r>
-      <w:r>
-        <w:t xml:space="preserve"> </w:t>
-      </w:r>
+    </w:p>
+    <w:p>
+      <w:pPr>
+        <w:pStyle w:val="Compact"/>
+        <w:numPr>
+          <w:ilvl w:val="0"/>
+          <w:numId w:val="1014"/>
+        </w:numPr>
+      </w:pPr>
       <w:r>
         <w:rPr>
           <w:b/>
@@ -1399,15 +1434,15 @@
       <w:r>
         <w:t xml:space="preserve">de gráficos de barras y circulares</w:t>
       </w:r>
-      <w:r>
-        <w:t xml:space="preserve"> </w:t>
-      </w:r>
-      <w:r>
-        <w:t xml:space="preserve">-</w:t>
-      </w:r>
-      <w:r>
-        <w:t xml:space="preserve"> </w:t>
-      </w:r>
+    </w:p>
+    <w:p>
+      <w:pPr>
+        <w:pStyle w:val="Compact"/>
+        <w:numPr>
+          <w:ilvl w:val="0"/>
+          <w:numId w:val="1014"/>
+        </w:numPr>
+      </w:pPr>
       <w:r>
         <w:rPr>
           <w:b/>
@@ -1421,15 +1456,15 @@
       <w:r>
         <w:t xml:space="preserve">de porcentajes paso a paso</w:t>
       </w:r>
-      <w:r>
-        <w:t xml:space="preserve"> </w:t>
-      </w:r>
-      <w:r>
-        <w:t xml:space="preserve">-</w:t>
-      </w:r>
-      <w:r>
-        <w:t xml:space="preserve"> </w:t>
-      </w:r>
+    </w:p>
+    <w:p>
+      <w:pPr>
+        <w:pStyle w:val="Compact"/>
+        <w:numPr>
+          <w:ilvl w:val="0"/>
+          <w:numId w:val="1014"/>
+        </w:numPr>
+      </w:pPr>
       <w:r>
         <w:rPr>
           <w:b/>
@@ -1446,7 +1481,7 @@
     </w:p>
     <w:p>
       <w:pPr>
-        <w:pStyle w:val="BodyText"/>
+        <w:pStyle w:val="FirstParagraph"/>
       </w:pPr>
       <w:r>
         <w:rPr>
@@ -1455,15 +1490,15 @@
         </w:rPr>
         <w:t xml:space="preserve">Parte de Confirmación (Paso 7):</w:t>
       </w:r>
-      <w:r>
-        <w:t xml:space="preserve"> </w:t>
-      </w:r>
-      <w:r>
-        <w:t xml:space="preserve">-</w:t>
-      </w:r>
-      <w:r>
-        <w:t xml:space="preserve"> </w:t>
-      </w:r>
+    </w:p>
+    <w:p>
+      <w:pPr>
+        <w:pStyle w:val="Compact"/>
+        <w:numPr>
+          <w:ilvl w:val="0"/>
+          <w:numId w:val="1015"/>
+        </w:numPr>
+      </w:pPr>
       <w:r>
         <w:rPr>
           <w:b/>
@@ -1477,15 +1512,15 @@
       <w:r>
         <w:t xml:space="preserve">entre su análisis numérico y la comprensión conceptual</w:t>
       </w:r>
-      <w:r>
-        <w:t xml:space="preserve"> </w:t>
-      </w:r>
-      <w:r>
-        <w:t xml:space="preserve">-</w:t>
-      </w:r>
-      <w:r>
-        <w:t xml:space="preserve"> </w:t>
-      </w:r>
+    </w:p>
+    <w:p>
+      <w:pPr>
+        <w:pStyle w:val="Compact"/>
+        <w:numPr>
+          <w:ilvl w:val="0"/>
+          <w:numId w:val="1015"/>
+        </w:numPr>
+      </w:pPr>
       <w:r>
         <w:rPr>
           <w:b/>
@@ -1499,15 +1534,15 @@
       <w:r>
         <w:t xml:space="preserve">entre múltiples opciones</w:t>
       </w:r>
-      <w:r>
-        <w:t xml:space="preserve"> </w:t>
-      </w:r>
-      <w:r>
-        <w:t xml:space="preserve">-</w:t>
-      </w:r>
-      <w:r>
-        <w:t xml:space="preserve"> </w:t>
-      </w:r>
+    </w:p>
+    <w:p>
+      <w:pPr>
+        <w:pStyle w:val="Compact"/>
+        <w:numPr>
+          <w:ilvl w:val="0"/>
+          <w:numId w:val="1015"/>
+        </w:numPr>
+      </w:pPr>
       <w:r>
         <w:rPr>
           <w:b/>
@@ -1537,17 +1572,17 @@
         <w:pStyle w:val="FirstParagraph"/>
       </w:pPr>
       <w:r>
-        <w:t xml:space="preserve">El valor de lana exportado desde Tebailandia en 1963 es de</w:t>
-      </w:r>
-      <w:r>
-        <w:t xml:space="preserve"> </w:t>
-      </w:r>
-      <w:r>
-        <w:rPr>
-          <w:b/>
-          <w:bCs/>
-        </w:rPr>
-        <w:t xml:space="preserve">4.56 millones de tebos</w:t>
+        <w:t xml:space="preserve">El valor de tomates exportado desde Tebailandia en 2005 es de</w:t>
+      </w:r>
+      <w:r>
+        <w:t xml:space="preserve"> </w:t>
+      </w:r>
+      <w:r>
+        <w:rPr>
+          <w:b/>
+          <w:bCs/>
+        </w:rPr>
+        <w:t xml:space="preserve">30.64 millones de tebos</w:t>
       </w:r>
       <w:r>
         <w:t xml:space="preserve">.</w:t>
@@ -1560,29 +1595,53 @@
       <w:r>
         <w:t xml:space="preserve">Esta respuesta es coherente porque:</w:t>
       </w:r>
-      <w:r>
-        <w:t xml:space="preserve"> </w:t>
-      </w:r>
-      <w:r>
-        <w:t xml:space="preserve">- Se basa en datos extraídos correctamente de ambos gráficos</w:t>
-      </w:r>
-      <w:r>
-        <w:t xml:space="preserve"> </w:t>
-      </w:r>
-      <w:r>
-        <w:t xml:space="preserve">- Aplica correctamente las fórmulas de porcentajes</w:t>
-      </w:r>
-      <w:r>
-        <w:t xml:space="preserve"> </w:t>
-      </w:r>
-      <w:r>
-        <w:t xml:space="preserve">- Todos los cálculos intermedios son verificables</w:t>
-      </w:r>
-      <w:r>
-        <w:t xml:space="preserve"> </w:t>
-      </w:r>
-      <w:r>
-        <w:t xml:space="preserve">- El procedimiento seleccionado es matemáticamente correcto</w:t>
+    </w:p>
+    <w:p>
+      <w:pPr>
+        <w:pStyle w:val="Compact"/>
+        <w:numPr>
+          <w:ilvl w:val="0"/>
+          <w:numId w:val="1016"/>
+        </w:numPr>
+      </w:pPr>
+      <w:r>
+        <w:t xml:space="preserve">Se basa en datos extraídos correctamente de ambos gráficos</w:t>
+      </w:r>
+    </w:p>
+    <w:p>
+      <w:pPr>
+        <w:pStyle w:val="Compact"/>
+        <w:numPr>
+          <w:ilvl w:val="0"/>
+          <w:numId w:val="1016"/>
+        </w:numPr>
+      </w:pPr>
+      <w:r>
+        <w:t xml:space="preserve">Aplica correctamente las fórmulas de porcentajes</w:t>
+      </w:r>
+    </w:p>
+    <w:p>
+      <w:pPr>
+        <w:pStyle w:val="Compact"/>
+        <w:numPr>
+          <w:ilvl w:val="0"/>
+          <w:numId w:val="1016"/>
+        </w:numPr>
+      </w:pPr>
+      <w:r>
+        <w:t xml:space="preserve">Todos los cálculos intermedios son verificables</w:t>
+      </w:r>
+    </w:p>
+    <w:p>
+      <w:pPr>
+        <w:pStyle w:val="Compact"/>
+        <w:numPr>
+          <w:ilvl w:val="0"/>
+          <w:numId w:val="1016"/>
+        </w:numPr>
+      </w:pPr>
+      <w:r>
+        <w:t xml:space="preserve">El procedimiento seleccionado es matemáticamente correcto</w:t>
       </w:r>
     </w:p>
     <w:bookmarkEnd w:id="44"/>
@@ -1613,7 +1672,7 @@
         <w:t xml:space="preserve"> </w:t>
       </w:r>
       <w:r>
-        <w:t xml:space="preserve">exsolution: 65.2|7|65.2|0.07|4.56|4.56|0010</w:t>
+        <w:t xml:space="preserve">exsolution: 68.1|45|68.1|0.45|30.65|30.64|0001</w:t>
       </w:r>
       <w:r>
         <w:t xml:space="preserve"> </w:t>
@@ -1899,6 +1958,21 @@
     <w:abstractNumId w:val="991"/>
   </w:num>
   <w:num w:numId="1011">
+    <w:abstractNumId w:val="991"/>
+  </w:num>
+  <w:num w:numId="1012">
+    <w:abstractNumId w:val="991"/>
+  </w:num>
+  <w:num w:numId="1013">
+    <w:abstractNumId w:val="991"/>
+  </w:num>
+  <w:num w:numId="1014">
+    <w:abstractNumId w:val="991"/>
+  </w:num>
+  <w:num w:numId="1015">
+    <w:abstractNumId w:val="991"/>
+  </w:num>
+  <w:num w:numId="1016">
     <w:abstractNumId w:val="991"/>
   </w:num>
 </w:numbering>

</xml_diff>

<commit_message>
Cloze Answer3: corregir duplicidad de campos y fallo de calificación automática; regenerar HTML/DOCX/XML y assets
- Evita repetir Answer3/Answer2 en el enunciado: se reemplazan referencias duplicadas por texto descriptivo ("porcentaje del Paso 2", "Valor del Paso 3").

- Mantiene exsolution/exclozetype/extol (6 num + 1 schoice) con tolerancias; alinea la presentación para un único campo por respuesta.

- Verificado en exports a Moodle: ahora cada paso crea exactamente un campo y se califica correctamente.

- Regenerados: HTML y DOCX del Rmd; XML de prueba para Moodle; imágenes de apoyo (grafico_barras.png, grafico_torta.png).
</commit_message>
<xml_diff>
--- a/Lab-Manjaro/ExportacionesGraficosEstadisticaInterpretacion_n3_v1/ExportacionesGraficosEstadisticaInterpretacion_n3_cloze_v1.docx
+++ b/Lab-Manjaro/ExportacionesGraficosEstadisticaInterpretacion_n3_v1/ExportacionesGraficosEstadisticaInterpretacion_n3_cloze_v1.docx
@@ -2,6 +2,15 @@
 <file path=word/document.xml><?xml version="1.0" encoding="utf-8"?>
 <w:document xmlns:w="http://schemas.openxmlformats.org/wordprocessingml/2006/main" xmlns:m="http://schemas.openxmlformats.org/officeDocument/2006/math" xmlns:r="http://schemas.openxmlformats.org/officeDocument/2006/relationships" xmlns:o="urn:schemas-microsoft-com:office:office" xmlns:v="urn:schemas-microsoft-com:vml" xmlns:w10="urn:schemas-microsoft-com:office:word" xmlns:a="http://schemas.openxmlformats.org/drawingml/2006/main" xmlns:pic="http://schemas.openxmlformats.org/drawingml/2006/picture" xmlns:wp="http://schemas.openxmlformats.org/drawingml/2006/wordprocessingDrawing">
   <w:body>
+    <w:bookmarkStart w:id="34" w:name="question"/>
+    <w:p>
+      <w:pPr>
+        <w:pStyle w:val="Heading1"/>
+      </w:pPr>
+      <w:r>
+        <w:t xml:space="preserve">Question</w:t>
+      </w:r>
+    </w:p>
     <w:p>
       <w:pPr>
         <w:pStyle w:val="FirstParagraph"/>
@@ -9,14 +18,14 @@
       <w:r>
         <w:drawing>
           <wp:inline>
-            <wp:extent cx="5334000" cy="3333750"/>
+            <wp:extent cx="5334000" cy="3314023"/>
             <wp:effectExtent b="0" l="0" r="0" t="0"/>
             <wp:docPr descr="" title="" id="21" name="Picture"/>
             <a:graphic>
               <a:graphicData uri="http://schemas.openxmlformats.org/drawingml/2006/picture">
                 <pic:pic>
                   <pic:nvPicPr>
-                    <pic:cNvPr descr="ExportacionesGraficosEstadisticaInterpretacion_n3_cloze_v1_files/figure-docx/GraficoBarras-1.png" id="22" name="Picture"/>
+                    <pic:cNvPr descr="grafico_barras.png" id="22" name="Picture"/>
                     <pic:cNvPicPr>
                       <a:picLocks noChangeArrowheads="1" noChangeAspect="1"/>
                     </pic:cNvPicPr>
@@ -30,7 +39,7 @@
                   <pic:spPr bwMode="auto">
                     <a:xfrm>
                       <a:off x="0" y="0"/>
-                      <a:ext cx="5334000" cy="3333750"/>
+                      <a:ext cx="5334000" cy="3314023"/>
                     </a:xfrm>
                     <a:prstGeom prst="rect">
                       <a:avLst/>
@@ -48,22 +57,17 @@
           </wp:inline>
         </w:drawing>
       </w:r>
-    </w:p>
-    <w:p>
-      <w:pPr>
-        <w:pStyle w:val="BodyText"/>
-      </w:pPr>
       <w:r>
         <w:drawing>
           <wp:inline>
-            <wp:extent cx="5334000" cy="4445000"/>
+            <wp:extent cx="4443984" cy="4248912"/>
             <wp:effectExtent b="0" l="0" r="0" t="0"/>
             <wp:docPr descr="" title="" id="24" name="Picture"/>
             <a:graphic>
               <a:graphicData uri="http://schemas.openxmlformats.org/drawingml/2006/picture">
                 <pic:pic>
                   <pic:nvPicPr>
-                    <pic:cNvPr descr="ExportacionesGraficosEstadisticaInterpretacion_n3_cloze_v1_files/figure-docx/GraficoTorta-3.png" id="25" name="Picture"/>
+                    <pic:cNvPr descr="grafico_torta.png" id="25" name="Picture"/>
                     <pic:cNvPicPr>
                       <a:picLocks noChangeArrowheads="1" noChangeAspect="1"/>
                     </pic:cNvPicPr>
@@ -77,7 +81,7 @@
                   <pic:spPr bwMode="auto">
                     <a:xfrm>
                       <a:off x="0" y="0"/>
-                      <a:ext cx="5334000" cy="4445000"/>
+                      <a:ext cx="4443984" cy="4248912"/>
                     </a:xfrm>
                     <a:prstGeom prst="rect">
                       <a:avLst/>
@@ -96,18 +100,9 @@
         </w:drawing>
       </w:r>
     </w:p>
-    <w:bookmarkStart w:id="34" w:name="question"/>
-    <w:p>
-      <w:pPr>
-        <w:pStyle w:val="Heading1"/>
-      </w:pPr>
-      <w:r>
-        <w:t xml:space="preserve">Question</w:t>
-      </w:r>
-    </w:p>
-    <w:p>
-      <w:pPr>
-        <w:pStyle w:val="FirstParagraph"/>
+    <w:p>
+      <w:pPr>
+        <w:pStyle w:val="BodyText"/>
       </w:pPr>
       <w:r>
         <w:t xml:space="preserve">La imagen muestra dos gráficos relacionados con las exportaciones de Tebailandia, un país que usa</w:t>
@@ -136,7 +131,7 @@
         <w:pStyle w:val="BodyText"/>
       </w:pPr>
       <w:r>
-        <w:t xml:space="preserve">Para determinar el valor específico de tomates exportado desde Tebailandia en 2005, resuelva paso a paso combinando información de ambos gráficos:</w:t>
+        <w:t xml:space="preserve">Para determinar el valor específico de trigo exportado desde Tebailandia en 1990, resuelva paso a paso combinando información de ambos gráficos:</w:t>
       </w:r>
     </w:p>
     <w:p>
@@ -227,7 +222,7 @@
         <w:pStyle w:val="FirstParagraph"/>
       </w:pPr>
       <w:r>
-        <w:t xml:space="preserve">Observe el primer gráfico. ¿Cuál fue el valor total de exportaciones de Tebailandia en 2005?</w:t>
+        <w:t xml:space="preserve">Observe el primer gráfico. ¿Cuál fue el valor total de exportaciones de Tebailandia en 1990?</w:t>
       </w:r>
     </w:p>
     <w:p>
@@ -263,7 +258,7 @@
         <w:pStyle w:val="FirstParagraph"/>
       </w:pPr>
       <w:r>
-        <w:t xml:space="preserve">Observe el segundo gráfico. ¿Qué porcentaje del total de exportaciones corresponde a tomates en 2005?</w:t>
+        <w:t xml:space="preserve">Observe el segundo gráfico. ¿Qué porcentaje del total de exportaciones corresponde a trigo en 1990?</w:t>
       </w:r>
     </w:p>
     <w:p>
@@ -299,7 +294,7 @@
         <w:pStyle w:val="FirstParagraph"/>
       </w:pPr>
       <w:r>
-        <w:t xml:space="preserve">Para calcular el valor de tomates, identifique los componentes de la fórmula:</w:t>
+        <w:t xml:space="preserve">Para calcular el valor de trigo, identifique los componentes de la fórmula:</w:t>
       </w:r>
     </w:p>
     <w:p>
@@ -307,7 +302,7 @@
         <w:pStyle w:val="BodyText"/>
       </w:pPr>
       <w:r>
-        <w:t xml:space="preserve">Valor de tomates = Valor total × (##ANSWER2##% ÷ 100)</w:t>
+        <w:t xml:space="preserve">Valor de trigo = Valor total × (porcentaje del Paso 2 ÷ 100)</w:t>
       </w:r>
     </w:p>
     <w:p>
@@ -341,7 +336,7 @@
         <w:pStyle w:val="BodyText"/>
       </w:pPr>
       <w:r>
-        <w:t xml:space="preserve">##ANSWER2##% ÷ 100 = ##ANSWER4##</w:t>
+        <w:t xml:space="preserve">Porcentaje del Paso 2 ÷ 100 = ##ANSWER4##</w:t>
       </w:r>
     </w:p>
     <w:bookmarkEnd w:id="29"/>
@@ -367,7 +362,7 @@
         <w:pStyle w:val="BodyText"/>
       </w:pPr>
       <w:r>
-        <w:t xml:space="preserve">##ANSWER3## × ##ANSWER4## = ##ANSWER5##</w:t>
+        <w:t xml:space="preserve">Valor del Paso 3 × ##ANSWER4## = ##ANSWER5##</w:t>
       </w:r>
     </w:p>
     <w:bookmarkEnd w:id="30"/>
@@ -385,7 +380,7 @@
         <w:pStyle w:val="FirstParagraph"/>
       </w:pPr>
       <w:r>
-        <w:t xml:space="preserve">Por lo tanto, el valor de tomates exportado en 2005 es:</w:t>
+        <w:t xml:space="preserve">Por lo tanto, el valor de trigo exportado en 1990 es:</w:t>
       </w:r>
     </w:p>
     <w:p>
@@ -451,7 +446,7 @@
         </w:numPr>
       </w:pPr>
       <w:r>
-        <w:t xml:space="preserve">Multiplicar el porcentaje de tomates por 100 y dividir entre el valor total de exportaciones.</w:t>
+        <w:t xml:space="preserve">Multiplicar el porcentaje de trigo por 100 y dividir entre el valor total de exportaciones.</w:t>
       </w:r>
     </w:p>
     <w:p>
@@ -463,7 +458,7 @@
         </w:numPr>
       </w:pPr>
       <w:r>
-        <w:t xml:space="preserve">Dividir el porcentaje de tomates entre el valor total de exportaciones de 2005.</w:t>
+        <w:t xml:space="preserve">Dividir el porcentaje de trigo entre el valor total de exportaciones de 1990.</w:t>
       </w:r>
     </w:p>
     <w:p>
@@ -475,7 +470,7 @@
         </w:numPr>
       </w:pPr>
       <w:r>
-        <w:t xml:space="preserve">Sumar el valor total de exportaciones de 2005 con el porcentaje de tomates.</w:t>
+        <w:t xml:space="preserve">Sumar el valor total de exportaciones de 1990 con el porcentaje de trigo.</w:t>
       </w:r>
     </w:p>
     <w:p>
@@ -487,7 +482,7 @@
         </w:numPr>
       </w:pPr>
       <w:r>
-        <w:t xml:space="preserve">Aplicar la fórmula: Valor del producto = Valor total × (45 ÷ 100).</w:t>
+        <w:t xml:space="preserve">Calcular el 5% del valor total de exportaciones de Tebailandia en 1990.</w:t>
       </w:r>
     </w:p>
     <w:bookmarkEnd w:id="33"/>
@@ -652,7 +647,7 @@
         <w:t xml:space="preserve"> </w:t>
       </w:r>
       <w:r>
-        <w:t xml:space="preserve">68.1 millones de tebos</w:t>
+        <w:t xml:space="preserve">46.4 millones de tebos</w:t>
       </w:r>
     </w:p>
     <w:p>
@@ -670,7 +665,7 @@
         <w:t xml:space="preserve"> </w:t>
       </w:r>
       <w:r>
-        <w:t xml:space="preserve">La lectura cuidadosa del gráfico de barras muestra que en 2005 las exportaciones totales de Tebailandia fueron exactamente 68.1 millones de tebos.</w:t>
+        <w:t xml:space="preserve">La lectura cuidadosa del gráfico de barras muestra que en 1990 las exportaciones totales de Tebailandia fueron exactamente 46.4 millones de tebos.</w:t>
       </w:r>
     </w:p>
     <w:p>
@@ -694,7 +689,7 @@
         </w:numPr>
       </w:pPr>
       <w:r>
-        <w:t xml:space="preserve">Año 2001: 10.7 millones de tebos</w:t>
+        <w:t xml:space="preserve">Año 1988: 16 millones de tebos</w:t>
       </w:r>
     </w:p>
     <w:p>
@@ -706,7 +701,7 @@
         </w:numPr>
       </w:pPr>
       <w:r>
-        <w:t xml:space="preserve">Año 2002: 35.7 millones de tebos</w:t>
+        <w:t xml:space="preserve">Año 1989: 37.2 millones de tebos</w:t>
       </w:r>
     </w:p>
     <w:p>
@@ -718,7 +713,17 @@
         </w:numPr>
       </w:pPr>
       <w:r>
-        <w:t xml:space="preserve">Año 2003: 40.8 millones de tebos</w:t>
+        <w:t xml:space="preserve">Año 1990: 46.4 millones de tebos ←</w:t>
+      </w:r>
+      <w:r>
+        <w:t xml:space="preserve"> </w:t>
+      </w:r>
+      <w:r>
+        <w:rPr>
+          <w:b/>
+          <w:bCs/>
+        </w:rPr>
+        <w:t xml:space="preserve">AÑO DE LA PREGUNTA</w:t>
       </w:r>
     </w:p>
     <w:p>
@@ -730,7 +735,7 @@
         </w:numPr>
       </w:pPr>
       <w:r>
-        <w:t xml:space="preserve">Año 2004: 47.9 millones de tebos</w:t>
+        <w:t xml:space="preserve">Año 1991: 52.8 millones de tebos</w:t>
       </w:r>
     </w:p>
     <w:p>
@@ -742,17 +747,7 @@
         </w:numPr>
       </w:pPr>
       <w:r>
-        <w:t xml:space="preserve">Año 2005: 68.1 millones de tebos ←</w:t>
-      </w:r>
-      <w:r>
-        <w:t xml:space="preserve"> </w:t>
-      </w:r>
-      <w:r>
-        <w:rPr>
-          <w:b/>
-          <w:bCs/>
-        </w:rPr>
-        <w:t xml:space="preserve">AÑO DE LA PREGUNTA</w:t>
+        <w:t xml:space="preserve">Año 1992: 84.9 millones de tebos</w:t>
       </w:r>
     </w:p>
     <w:bookmarkEnd w:id="36"/>
@@ -780,7 +775,7 @@
         <w:t xml:space="preserve"> </w:t>
       </w:r>
       <w:r>
-        <w:t xml:space="preserve">45%</w:t>
+        <w:t xml:space="preserve">5%</w:t>
       </w:r>
     </w:p>
     <w:p>
@@ -798,7 +793,7 @@
         <w:t xml:space="preserve"> </w:t>
       </w:r>
       <w:r>
-        <w:t xml:space="preserve">El gráfico circular muestra que tomates representa exactamente el 45% del total de exportaciones en 2005.</w:t>
+        <w:t xml:space="preserve">El gráfico circular muestra que trigo representa exactamente el 5% del total de exportaciones en 1990.</w:t>
       </w:r>
     </w:p>
     <w:p>
@@ -822,7 +817,7 @@
         </w:numPr>
       </w:pPr>
       <w:r>
-        <w:t xml:space="preserve">tomates: 45% ←</w:t>
+        <w:t xml:space="preserve">trigo: 5% ←</w:t>
       </w:r>
       <w:r>
         <w:t xml:space="preserve"> </w:t>
@@ -844,7 +839,7 @@
         </w:numPr>
       </w:pPr>
       <w:r>
-        <w:t xml:space="preserve">tabaco: 7%</w:t>
+        <w:t xml:space="preserve">carne de res: 5%</w:t>
       </w:r>
     </w:p>
     <w:p>
@@ -856,7 +851,7 @@
         </w:numPr>
       </w:pPr>
       <w:r>
-        <w:t xml:space="preserve">uvas: 6%</w:t>
+        <w:t xml:space="preserve">café: 5%</w:t>
       </w:r>
     </w:p>
     <w:p>
@@ -868,7 +863,7 @@
         </w:numPr>
       </w:pPr>
       <w:r>
-        <w:t xml:space="preserve">aves de corral: 5%</w:t>
+        <w:t xml:space="preserve">pepinos: 5%</w:t>
       </w:r>
     </w:p>
     <w:p>
@@ -880,7 +875,7 @@
         </w:numPr>
       </w:pPr>
       <w:r>
-        <w:t xml:space="preserve">trigo: 5%</w:t>
+        <w:t xml:space="preserve">ajo: 6%</w:t>
       </w:r>
     </w:p>
     <w:p>
@@ -892,7 +887,7 @@
         </w:numPr>
       </w:pPr>
       <w:r>
-        <w:t xml:space="preserve">celulares: 5%</w:t>
+        <w:t xml:space="preserve">azúcar: 64%</w:t>
       </w:r>
     </w:p>
     <w:p>
@@ -904,7 +899,7 @@
         </w:numPr>
       </w:pPr>
       <w:r>
-        <w:t xml:space="preserve">lana: 22%</w:t>
+        <w:t xml:space="preserve">cebada: 5%</w:t>
       </w:r>
     </w:p>
     <w:p>
@@ -916,7 +911,7 @@
         </w:numPr>
       </w:pPr>
       <w:r>
-        <w:t xml:space="preserve">limones: 5%</w:t>
+        <w:t xml:space="preserve">piñas: 5%</w:t>
       </w:r>
     </w:p>
     <w:bookmarkEnd w:id="37"/>
@@ -944,7 +939,7 @@
         <w:t xml:space="preserve"> </w:t>
       </w:r>
       <w:r>
-        <w:t xml:space="preserve">68.1</w:t>
+        <w:t xml:space="preserve">46.4</w:t>
       </w:r>
     </w:p>
     <w:p>
@@ -962,7 +957,7 @@
         <w:t xml:space="preserve"> </w:t>
       </w:r>
       <w:r>
-        <w:t xml:space="preserve">Para calcular el valor de tomates, necesitamos usar el valor total de exportaciones identificado en el Paso 1 como numerador de la fórmula.</w:t>
+        <w:t xml:space="preserve">Para calcular el valor de trigo, necesitamos usar el valor total de exportaciones identificado en el Paso 1 como numerador de la fórmula.</w:t>
       </w:r>
     </w:p>
     <w:bookmarkEnd w:id="38"/>
@@ -990,7 +985,7 @@
         <w:t xml:space="preserve"> </w:t>
       </w:r>
       <w:r>
-        <w:t xml:space="preserve">0.4500</w:t>
+        <w:t xml:space="preserve">0.0500</w:t>
       </w:r>
     </w:p>
     <w:p>
@@ -1014,7 +1009,7 @@
         <w:t xml:space="preserve"> </w:t>
       </w:r>
       <w:r>
-        <w:t xml:space="preserve">45% ÷ 100 = 0.4500</w:t>
+        <w:t xml:space="preserve">5% ÷ 100 = 0.0500</w:t>
       </w:r>
     </w:p>
     <w:bookmarkEnd w:id="39"/>
@@ -1042,7 +1037,7 @@
         <w:t xml:space="preserve"> </w:t>
       </w:r>
       <w:r>
-        <w:t xml:space="preserve">30.65</w:t>
+        <w:t xml:space="preserve">2.32</w:t>
       </w:r>
     </w:p>
     <w:p>
@@ -1060,7 +1055,7 @@
         <w:t xml:space="preserve"> </w:t>
       </w:r>
       <w:r>
-        <w:t xml:space="preserve">68.1 × 0.4500 = 30.65</w:t>
+        <w:t xml:space="preserve">46.4 × 0.0500 = 2.32</w:t>
       </w:r>
     </w:p>
     <w:bookmarkEnd w:id="40"/>
@@ -1088,7 +1083,7 @@
         <w:t xml:space="preserve"> </w:t>
       </w:r>
       <w:r>
-        <w:t xml:space="preserve">30.64 millones de tebos</w:t>
+        <w:t xml:space="preserve">2.32 millones de tebos</w:t>
       </w:r>
     </w:p>
     <w:p>
@@ -1112,7 +1107,7 @@
         </w:numPr>
       </w:pPr>
       <w:r>
-        <w:t xml:space="preserve">El resultado (30.64 millones) es menor que el total (68.1 millones), lo cual es lógico ya que representa solo una fracción del total.</w:t>
+        <w:t xml:space="preserve">El resultado (2.32 millones) es menor que el total (46.4 millones), lo cual es lógico ya que representa solo una fracción del total.</w:t>
       </w:r>
     </w:p>
     <w:p>
@@ -1165,7 +1160,7 @@
         <w:t xml:space="preserve">A</w:t>
       </w:r>
       <w:r>
-        <w:t xml:space="preserve">: Multiplicar el porcentaje de tomates por 100 y dividir entre el valor total de exportaciones.</w:t>
+        <w:t xml:space="preserve">: Multiplicar el porcentaje de trigo por 100 y dividir entre el valor total de exportaciones.</w:t>
       </w:r>
     </w:p>
     <w:p>
@@ -1184,7 +1179,7 @@
         <w:t xml:space="preserve">B</w:t>
       </w:r>
       <w:r>
-        <w:t xml:space="preserve">: Dividir el porcentaje de tomates entre el valor total de exportaciones de 2005.</w:t>
+        <w:t xml:space="preserve">: Dividir el porcentaje de trigo entre el valor total de exportaciones de 1990.</w:t>
       </w:r>
     </w:p>
     <w:p>
@@ -1203,7 +1198,7 @@
         <w:t xml:space="preserve">C</w:t>
       </w:r>
       <w:r>
-        <w:t xml:space="preserve">: Sumar el valor total de exportaciones de 2005 con el porcentaje de tomates.</w:t>
+        <w:t xml:space="preserve">: Sumar el valor total de exportaciones de 1990 con el porcentaje de trigo.</w:t>
       </w:r>
     </w:p>
     <w:p>
@@ -1222,7 +1217,7 @@
         <w:t xml:space="preserve">D</w:t>
       </w:r>
       <w:r>
-        <w:t xml:space="preserve">: Aplicar la fórmula: Valor del producto = Valor total × (45 ÷ 100). ←</w:t>
+        <w:t xml:space="preserve">: Calcular el 5% del valor total de exportaciones de Tebailandia en 1990. ←</w:t>
       </w:r>
       <w:r>
         <w:t xml:space="preserve"> </w:t>
@@ -1255,7 +1250,7 @@
         <w:t xml:space="preserve">“</w:t>
       </w:r>
       <w:r>
-        <w:t xml:space="preserve">Aplicar la fórmula: Valor del producto = Valor total × (45 ÷ 100).</w:t>
+        <w:t xml:space="preserve">Calcular el 5% del valor total de exportaciones de Tebailandia en 1990.</w:t>
       </w:r>
       <w:r>
         <w:t xml:space="preserve">”</w:t>
@@ -1328,7 +1323,7 @@
         </w:numPr>
       </w:pPr>
       <w:r>
-        <w:t xml:space="preserve">Valor total de exportaciones en 2005: 68.1 millones de tebos</w:t>
+        <w:t xml:space="preserve">Valor total de exportaciones en 1990: 46.4 millones de tebos</w:t>
       </w:r>
     </w:p>
     <w:p>
@@ -1340,7 +1335,7 @@
         </w:numPr>
       </w:pPr>
       <w:r>
-        <w:t xml:space="preserve">Porcentaje de tomates: 45%</w:t>
+        <w:t xml:space="preserve">Porcentaje de trigo: 5%</w:t>
       </w:r>
     </w:p>
     <w:p>
@@ -1352,7 +1347,7 @@
         </w:numPr>
       </w:pPr>
       <w:r>
-        <w:t xml:space="preserve">Porcentaje en decimal: 0.4500</w:t>
+        <w:t xml:space="preserve">Porcentaje en decimal: 0.0500</w:t>
       </w:r>
     </w:p>
     <w:p>
@@ -1364,7 +1359,7 @@
         </w:numPr>
       </w:pPr>
       <w:r>
-        <w:t xml:space="preserve">Valor final de tomates: 30.64 millones de tebos</w:t>
+        <w:t xml:space="preserve">Valor final de trigo: 2.32 millones de tebos</w:t>
       </w:r>
     </w:p>
     <w:p>
@@ -1572,17 +1567,17 @@
         <w:pStyle w:val="FirstParagraph"/>
       </w:pPr>
       <w:r>
-        <w:t xml:space="preserve">El valor de tomates exportado desde Tebailandia en 2005 es de</w:t>
-      </w:r>
-      <w:r>
-        <w:t xml:space="preserve"> </w:t>
-      </w:r>
-      <w:r>
-        <w:rPr>
-          <w:b/>
-          <w:bCs/>
-        </w:rPr>
-        <w:t xml:space="preserve">30.64 millones de tebos</w:t>
+        <w:t xml:space="preserve">El valor de trigo exportado desde Tebailandia en 1990 es de</w:t>
+      </w:r>
+      <w:r>
+        <w:t xml:space="preserve"> </w:t>
+      </w:r>
+      <w:r>
+        <w:rPr>
+          <w:b/>
+          <w:bCs/>
+        </w:rPr>
+        <w:t xml:space="preserve">2.32 millones de tebos</w:t>
       </w:r>
       <w:r>
         <w:t xml:space="preserve">.</w:t>
@@ -1672,7 +1667,7 @@
         <w:t xml:space="preserve"> </w:t>
       </w:r>
       <w:r>
-        <w:t xml:space="preserve">exsolution: 68.1|45|68.1|0.45|30.65|30.64|0001</w:t>
+        <w:t xml:space="preserve">exsolution: 46.4|5|46.4|0.05|2.32|2.32|0001</w:t>
       </w:r>
       <w:r>
         <w:t xml:space="preserve"> </w:t>

</xml_diff>

<commit_message>
Testing integral cloze n3: testthat completo + fix duplicidad Answer4 en Question; validaciones de datos, ce1lculos, formato cloze, exportacif3n (Moodle/HTML/QTI21), calificacif3n simulada y robustez (n=50)
- Agrega tests en tests/testthat/test_cloze_n3.R con coberturas de requisitos 1-6 (datos, ce1lculos, placeholders, exsolution/exclozetype/extol, exportadores, tolerancias, robustez).

- Corrige Rmd: reemplaza segunda aparicif3n de ##ANSWER4## en Paso 5 por texto descriptivo para evitar campos duplicados (error en QTI).

- Regenera HTML/DOCX del ejercicio.
</commit_message>
<xml_diff>
--- a/Lab-Manjaro/ExportacionesGraficosEstadisticaInterpretacion_n3_v1/ExportacionesGraficosEstadisticaInterpretacion_n3_cloze_v1.docx
+++ b/Lab-Manjaro/ExportacionesGraficosEstadisticaInterpretacion_n3_v1/ExportacionesGraficosEstadisticaInterpretacion_n3_cloze_v1.docx
@@ -60,7 +60,7 @@
       <w:r>
         <w:drawing>
           <wp:inline>
-            <wp:extent cx="4443984" cy="4248912"/>
+            <wp:extent cx="4864608" cy="4309872"/>
             <wp:effectExtent b="0" l="0" r="0" t="0"/>
             <wp:docPr descr="" title="" id="24" name="Picture"/>
             <a:graphic>
@@ -81,7 +81,7 @@
                   <pic:spPr bwMode="auto">
                     <a:xfrm>
                       <a:off x="0" y="0"/>
-                      <a:ext cx="4443984" cy="4248912"/>
+                      <a:ext cx="4864608" cy="4309872"/>
                     </a:xfrm>
                     <a:prstGeom prst="rect">
                       <a:avLst/>
@@ -131,7 +131,7 @@
         <w:pStyle w:val="BodyText"/>
       </w:pPr>
       <w:r>
-        <w:t xml:space="preserve">Para determinar el valor específico de trigo exportado desde Tebailandia en 1990, resuelva paso a paso combinando información de ambos gráficos:</w:t>
+        <w:t xml:space="preserve">Para determinar el valor específico de tomates exportado desde Tebailandia en 1968, resuelva paso a paso combinando información de ambos gráficos:</w:t>
       </w:r>
     </w:p>
     <w:p>
@@ -222,7 +222,7 @@
         <w:pStyle w:val="FirstParagraph"/>
       </w:pPr>
       <w:r>
-        <w:t xml:space="preserve">Observe el primer gráfico. ¿Cuál fue el valor total de exportaciones de Tebailandia en 1990?</w:t>
+        <w:t xml:space="preserve">Observe el primer gráfico. ¿Cuál fue el valor total de exportaciones de Tebailandia en 1968?</w:t>
       </w:r>
     </w:p>
     <w:p>
@@ -258,7 +258,7 @@
         <w:pStyle w:val="FirstParagraph"/>
       </w:pPr>
       <w:r>
-        <w:t xml:space="preserve">Observe el segundo gráfico. ¿Qué porcentaje del total de exportaciones corresponde a trigo en 1990?</w:t>
+        <w:t xml:space="preserve">Observe el segundo gráfico. ¿Qué porcentaje del total de exportaciones corresponde a tomates en 1968?</w:t>
       </w:r>
     </w:p>
     <w:p>
@@ -294,7 +294,7 @@
         <w:pStyle w:val="FirstParagraph"/>
       </w:pPr>
       <w:r>
-        <w:t xml:space="preserve">Para calcular el valor de trigo, identifique los componentes de la fórmula:</w:t>
+        <w:t xml:space="preserve">Para calcular el valor de tomates, identifique los componentes de la fórmula:</w:t>
       </w:r>
     </w:p>
     <w:p>
@@ -302,7 +302,7 @@
         <w:pStyle w:val="BodyText"/>
       </w:pPr>
       <w:r>
-        <w:t xml:space="preserve">Valor de trigo = Valor total × (porcentaje del Paso 2 ÷ 100)</w:t>
+        <w:t xml:space="preserve">Valor de tomates = Valor total × (porcentaje del Paso 2 ÷ 100)</w:t>
       </w:r>
     </w:p>
     <w:p>
@@ -362,7 +362,7 @@
         <w:pStyle w:val="BodyText"/>
       </w:pPr>
       <w:r>
-        <w:t xml:space="preserve">Valor del Paso 3 × ##ANSWER4## = ##ANSWER5##</w:t>
+        <w:t xml:space="preserve">Valor del Paso 3 × valor decimal del Paso 4 = ##ANSWER5##</w:t>
       </w:r>
     </w:p>
     <w:bookmarkEnd w:id="30"/>
@@ -380,7 +380,7 @@
         <w:pStyle w:val="FirstParagraph"/>
       </w:pPr>
       <w:r>
-        <w:t xml:space="preserve">Por lo tanto, el valor de trigo exportado en 1990 es:</w:t>
+        <w:t xml:space="preserve">Por lo tanto, el valor de tomates exportado en 1968 es:</w:t>
       </w:r>
     </w:p>
     <w:p>
@@ -446,7 +446,7 @@
         </w:numPr>
       </w:pPr>
       <w:r>
-        <w:t xml:space="preserve">Multiplicar el porcentaje de trigo por 100 y dividir entre el valor total de exportaciones.</w:t>
+        <w:t xml:space="preserve">Dividir el porcentaje de tomates entre el valor total de exportaciones de 1968.</w:t>
       </w:r>
     </w:p>
     <w:p>
@@ -458,7 +458,7 @@
         </w:numPr>
       </w:pPr>
       <w:r>
-        <w:t xml:space="preserve">Dividir el porcentaje de trigo entre el valor total de exportaciones de 1990.</w:t>
+        <w:t xml:space="preserve">Multiplicar el valor total de exportaciones de 1968 por el porcentaje de tomates expresado en forma decimal.</w:t>
       </w:r>
     </w:p>
     <w:p>
@@ -470,7 +470,7 @@
         </w:numPr>
       </w:pPr>
       <w:r>
-        <w:t xml:space="preserve">Sumar el valor total de exportaciones de 1990 con el porcentaje de trigo.</w:t>
+        <w:t xml:space="preserve">Multiplicar el porcentaje de tomates por 100 y dividir entre el valor total de exportaciones.</w:t>
       </w:r>
     </w:p>
     <w:p>
@@ -482,7 +482,7 @@
         </w:numPr>
       </w:pPr>
       <w:r>
-        <w:t xml:space="preserve">Calcular el 5% del valor total de exportaciones de Tebailandia en 1990.</w:t>
+        <w:t xml:space="preserve">Sumar el valor total de exportaciones de 1968 con el porcentaje de tomates.</w:t>
       </w:r>
     </w:p>
     <w:bookmarkEnd w:id="33"/>
@@ -647,7 +647,7 @@
         <w:t xml:space="preserve"> </w:t>
       </w:r>
       <w:r>
-        <w:t xml:space="preserve">46.4 millones de tebos</w:t>
+        <w:t xml:space="preserve">60.2 millones de tebos</w:t>
       </w:r>
     </w:p>
     <w:p>
@@ -665,7 +665,7 @@
         <w:t xml:space="preserve"> </w:t>
       </w:r>
       <w:r>
-        <w:t xml:space="preserve">La lectura cuidadosa del gráfico de barras muestra que en 1990 las exportaciones totales de Tebailandia fueron exactamente 46.4 millones de tebos.</w:t>
+        <w:t xml:space="preserve">La lectura cuidadosa del gráfico de barras muestra que en 1968 las exportaciones totales de Tebailandia fueron exactamente 60.2 millones de tebos.</w:t>
       </w:r>
     </w:p>
     <w:p>
@@ -689,7 +689,7 @@
         </w:numPr>
       </w:pPr>
       <w:r>
-        <w:t xml:space="preserve">Año 1988: 16 millones de tebos</w:t>
+        <w:t xml:space="preserve">Año 1965: 15.7 millones de tebos</w:t>
       </w:r>
     </w:p>
     <w:p>
@@ -701,7 +701,7 @@
         </w:numPr>
       </w:pPr>
       <w:r>
-        <w:t xml:space="preserve">Año 1989: 37.2 millones de tebos</w:t>
+        <w:t xml:space="preserve">Año 1966: 43.2 millones de tebos</w:t>
       </w:r>
     </w:p>
     <w:p>
@@ -713,7 +713,19 @@
         </w:numPr>
       </w:pPr>
       <w:r>
-        <w:t xml:space="preserve">Año 1990: 46.4 millones de tebos ←</w:t>
+        <w:t xml:space="preserve">Año 1967: 45.4 millones de tebos</w:t>
+      </w:r>
+    </w:p>
+    <w:p>
+      <w:pPr>
+        <w:pStyle w:val="Compact"/>
+        <w:numPr>
+          <w:ilvl w:val="0"/>
+          <w:numId w:val="1008"/>
+        </w:numPr>
+      </w:pPr>
+      <w:r>
+        <w:t xml:space="preserve">Año 1968: 60.2 millones de tebos ←</w:t>
       </w:r>
       <w:r>
         <w:t xml:space="preserve"> </w:t>
@@ -735,19 +747,7 @@
         </w:numPr>
       </w:pPr>
       <w:r>
-        <w:t xml:space="preserve">Año 1991: 52.8 millones de tebos</w:t>
-      </w:r>
-    </w:p>
-    <w:p>
-      <w:pPr>
-        <w:pStyle w:val="Compact"/>
-        <w:numPr>
-          <w:ilvl w:val="0"/>
-          <w:numId w:val="1008"/>
-        </w:numPr>
-      </w:pPr>
-      <w:r>
-        <w:t xml:space="preserve">Año 1992: 84.9 millones de tebos</w:t>
+        <w:t xml:space="preserve">Año 1969: 68.6 millones de tebos</w:t>
       </w:r>
     </w:p>
     <w:bookmarkEnd w:id="36"/>
@@ -775,7 +775,7 @@
         <w:t xml:space="preserve"> </w:t>
       </w:r>
       <w:r>
-        <w:t xml:space="preserve">5%</w:t>
+        <w:t xml:space="preserve">24%</w:t>
       </w:r>
     </w:p>
     <w:p>
@@ -793,7 +793,7 @@
         <w:t xml:space="preserve"> </w:t>
       </w:r>
       <w:r>
-        <w:t xml:space="preserve">El gráfico circular muestra que trigo representa exactamente el 5% del total de exportaciones en 1990.</w:t>
+        <w:t xml:space="preserve">El gráfico circular muestra que tomates representa exactamente el 24% del total de exportaciones en 1968.</w:t>
       </w:r>
     </w:p>
     <w:p>
@@ -817,7 +817,55 @@
         </w:numPr>
       </w:pPr>
       <w:r>
-        <w:t xml:space="preserve">trigo: 5% ←</w:t>
+        <w:t xml:space="preserve">pepinos: 5%</w:t>
+      </w:r>
+    </w:p>
+    <w:p>
+      <w:pPr>
+        <w:pStyle w:val="Compact"/>
+        <w:numPr>
+          <w:ilvl w:val="0"/>
+          <w:numId w:val="1009"/>
+        </w:numPr>
+      </w:pPr>
+      <w:r>
+        <w:t xml:space="preserve">limones: 17%</w:t>
+      </w:r>
+    </w:p>
+    <w:p>
+      <w:pPr>
+        <w:pStyle w:val="Compact"/>
+        <w:numPr>
+          <w:ilvl w:val="0"/>
+          <w:numId w:val="1009"/>
+        </w:numPr>
+      </w:pPr>
+      <w:r>
+        <w:t xml:space="preserve">cerdo: 5%</w:t>
+      </w:r>
+    </w:p>
+    <w:p>
+      <w:pPr>
+        <w:pStyle w:val="Compact"/>
+        <w:numPr>
+          <w:ilvl w:val="0"/>
+          <w:numId w:val="1009"/>
+        </w:numPr>
+      </w:pPr>
+      <w:r>
+        <w:t xml:space="preserve">lana: 10%</w:t>
+      </w:r>
+    </w:p>
+    <w:p>
+      <w:pPr>
+        <w:pStyle w:val="Compact"/>
+        <w:numPr>
+          <w:ilvl w:val="0"/>
+          <w:numId w:val="1009"/>
+        </w:numPr>
+      </w:pPr>
+      <w:r>
+        <w:t xml:space="preserve">tomates: 24% ←</w:t>
       </w:r>
       <w:r>
         <w:t xml:space="preserve"> </w:t>
@@ -839,7 +887,7 @@
         </w:numPr>
       </w:pPr>
       <w:r>
-        <w:t xml:space="preserve">carne de res: 5%</w:t>
+        <w:t xml:space="preserve">oro: 6%</w:t>
       </w:r>
     </w:p>
     <w:p>
@@ -851,7 +899,7 @@
         </w:numPr>
       </w:pPr>
       <w:r>
-        <w:t xml:space="preserve">café: 5%</w:t>
+        <w:t xml:space="preserve">café: 7%</w:t>
       </w:r>
     </w:p>
     <w:p>
@@ -863,55 +911,7 @@
         </w:numPr>
       </w:pPr>
       <w:r>
-        <w:t xml:space="preserve">pepinos: 5%</w:t>
-      </w:r>
-    </w:p>
-    <w:p>
-      <w:pPr>
-        <w:pStyle w:val="Compact"/>
-        <w:numPr>
-          <w:ilvl w:val="0"/>
-          <w:numId w:val="1009"/>
-        </w:numPr>
-      </w:pPr>
-      <w:r>
-        <w:t xml:space="preserve">ajo: 6%</w:t>
-      </w:r>
-    </w:p>
-    <w:p>
-      <w:pPr>
-        <w:pStyle w:val="Compact"/>
-        <w:numPr>
-          <w:ilvl w:val="0"/>
-          <w:numId w:val="1009"/>
-        </w:numPr>
-      </w:pPr>
-      <w:r>
-        <w:t xml:space="preserve">azúcar: 64%</w:t>
-      </w:r>
-    </w:p>
-    <w:p>
-      <w:pPr>
-        <w:pStyle w:val="Compact"/>
-        <w:numPr>
-          <w:ilvl w:val="0"/>
-          <w:numId w:val="1009"/>
-        </w:numPr>
-      </w:pPr>
-      <w:r>
-        <w:t xml:space="preserve">cebada: 5%</w:t>
-      </w:r>
-    </w:p>
-    <w:p>
-      <w:pPr>
-        <w:pStyle w:val="Compact"/>
-        <w:numPr>
-          <w:ilvl w:val="0"/>
-          <w:numId w:val="1009"/>
-        </w:numPr>
-      </w:pPr>
-      <w:r>
-        <w:t xml:space="preserve">piñas: 5%</w:t>
+        <w:t xml:space="preserve">carne de res: 26%</w:t>
       </w:r>
     </w:p>
     <w:bookmarkEnd w:id="37"/>
@@ -939,7 +939,7 @@
         <w:t xml:space="preserve"> </w:t>
       </w:r>
       <w:r>
-        <w:t xml:space="preserve">46.4</w:t>
+        <w:t xml:space="preserve">60.2</w:t>
       </w:r>
     </w:p>
     <w:p>
@@ -957,7 +957,7 @@
         <w:t xml:space="preserve"> </w:t>
       </w:r>
       <w:r>
-        <w:t xml:space="preserve">Para calcular el valor de trigo, necesitamos usar el valor total de exportaciones identificado en el Paso 1 como numerador de la fórmula.</w:t>
+        <w:t xml:space="preserve">Para calcular el valor de tomates, necesitamos usar el valor total de exportaciones identificado en el Paso 1 como numerador de la fórmula.</w:t>
       </w:r>
     </w:p>
     <w:bookmarkEnd w:id="38"/>
@@ -985,7 +985,7 @@
         <w:t xml:space="preserve"> </w:t>
       </w:r>
       <w:r>
-        <w:t xml:space="preserve">0.0500</w:t>
+        <w:t xml:space="preserve">0.2400</w:t>
       </w:r>
     </w:p>
     <w:p>
@@ -1009,7 +1009,7 @@
         <w:t xml:space="preserve"> </w:t>
       </w:r>
       <w:r>
-        <w:t xml:space="preserve">5% ÷ 100 = 0.0500</w:t>
+        <w:t xml:space="preserve">24% ÷ 100 = 0.2400</w:t>
       </w:r>
     </w:p>
     <w:bookmarkEnd w:id="39"/>
@@ -1037,7 +1037,7 @@
         <w:t xml:space="preserve"> </w:t>
       </w:r>
       <w:r>
-        <w:t xml:space="preserve">2.32</w:t>
+        <w:t xml:space="preserve">14.45</w:t>
       </w:r>
     </w:p>
     <w:p>
@@ -1055,7 +1055,7 @@
         <w:t xml:space="preserve"> </w:t>
       </w:r>
       <w:r>
-        <w:t xml:space="preserve">46.4 × 0.0500 = 2.32</w:t>
+        <w:t xml:space="preserve">60.2 × 0.2400 = 14.45</w:t>
       </w:r>
     </w:p>
     <w:bookmarkEnd w:id="40"/>
@@ -1083,7 +1083,7 @@
         <w:t xml:space="preserve"> </w:t>
       </w:r>
       <w:r>
-        <w:t xml:space="preserve">2.32 millones de tebos</w:t>
+        <w:t xml:space="preserve">14.45 millones de tebos</w:t>
       </w:r>
     </w:p>
     <w:p>
@@ -1107,7 +1107,7 @@
         </w:numPr>
       </w:pPr>
       <w:r>
-        <w:t xml:space="preserve">El resultado (2.32 millones) es menor que el total (46.4 millones), lo cual es lógico ya que representa solo una fracción del total.</w:t>
+        <w:t xml:space="preserve">El resultado (14.45 millones) es menor que el total (60.2 millones), lo cual es lógico ya que representa solo una fracción del total.</w:t>
       </w:r>
     </w:p>
     <w:p>
@@ -1160,7 +1160,7 @@
         <w:t xml:space="preserve">A</w:t>
       </w:r>
       <w:r>
-        <w:t xml:space="preserve">: Multiplicar el porcentaje de trigo por 100 y dividir entre el valor total de exportaciones.</w:t>
+        <w:t xml:space="preserve">: Dividir el porcentaje de tomates entre el valor total de exportaciones de 1968.</w:t>
       </w:r>
     </w:p>
     <w:p>
@@ -1179,7 +1179,17 @@
         <w:t xml:space="preserve">B</w:t>
       </w:r>
       <w:r>
-        <w:t xml:space="preserve">: Dividir el porcentaje de trigo entre el valor total de exportaciones de 1990.</w:t>
+        <w:t xml:space="preserve">: Multiplicar el valor total de exportaciones de 1968 por el porcentaje de tomates expresado en forma decimal. ←</w:t>
+      </w:r>
+      <w:r>
+        <w:t xml:space="preserve"> </w:t>
+      </w:r>
+      <w:r>
+        <w:rPr>
+          <w:b/>
+          <w:bCs/>
+        </w:rPr>
+        <w:t xml:space="preserve">RESPUESTA CORRECTA</w:t>
       </w:r>
     </w:p>
     <w:p>
@@ -1198,7 +1208,7 @@
         <w:t xml:space="preserve">C</w:t>
       </w:r>
       <w:r>
-        <w:t xml:space="preserve">: Sumar el valor total de exportaciones de 1990 con el porcentaje de trigo.</w:t>
+        <w:t xml:space="preserve">: Multiplicar el porcentaje de tomates por 100 y dividir entre el valor total de exportaciones.</w:t>
       </w:r>
     </w:p>
     <w:p>
@@ -1217,17 +1227,7 @@
         <w:t xml:space="preserve">D</w:t>
       </w:r>
       <w:r>
-        <w:t xml:space="preserve">: Calcular el 5% del valor total de exportaciones de Tebailandia en 1990. ←</w:t>
-      </w:r>
-      <w:r>
-        <w:t xml:space="preserve"> </w:t>
-      </w:r>
-      <w:r>
-        <w:rPr>
-          <w:b/>
-          <w:bCs/>
-        </w:rPr>
-        <w:t xml:space="preserve">RESPUESTA CORRECTA</w:t>
+        <w:t xml:space="preserve">: Sumar el valor total de exportaciones de 1968 con el porcentaje de tomates.</w:t>
       </w:r>
     </w:p>
     <w:p>
@@ -1250,7 +1250,7 @@
         <w:t xml:space="preserve">“</w:t>
       </w:r>
       <w:r>
-        <w:t xml:space="preserve">Calcular el 5% del valor total de exportaciones de Tebailandia en 1990.</w:t>
+        <w:t xml:space="preserve">Multiplicar el valor total de exportaciones de 1968 por el porcentaje de tomates expresado en forma decimal.</w:t>
       </w:r>
       <w:r>
         <w:t xml:space="preserve">”</w:t>
@@ -1323,7 +1323,7 @@
         </w:numPr>
       </w:pPr>
       <w:r>
-        <w:t xml:space="preserve">Valor total de exportaciones en 1990: 46.4 millones de tebos</w:t>
+        <w:t xml:space="preserve">Valor total de exportaciones en 1968: 60.2 millones de tebos</w:t>
       </w:r>
     </w:p>
     <w:p>
@@ -1335,7 +1335,7 @@
         </w:numPr>
       </w:pPr>
       <w:r>
-        <w:t xml:space="preserve">Porcentaje de trigo: 5%</w:t>
+        <w:t xml:space="preserve">Porcentaje de tomates: 24%</w:t>
       </w:r>
     </w:p>
     <w:p>
@@ -1347,7 +1347,7 @@
         </w:numPr>
       </w:pPr>
       <w:r>
-        <w:t xml:space="preserve">Porcentaje en decimal: 0.0500</w:t>
+        <w:t xml:space="preserve">Porcentaje en decimal: 0.2400</w:t>
       </w:r>
     </w:p>
     <w:p>
@@ -1359,7 +1359,7 @@
         </w:numPr>
       </w:pPr>
       <w:r>
-        <w:t xml:space="preserve">Valor final de trigo: 2.32 millones de tebos</w:t>
+        <w:t xml:space="preserve">Valor final de tomates: 14.45 millones de tebos</w:t>
       </w:r>
     </w:p>
     <w:p>
@@ -1567,17 +1567,17 @@
         <w:pStyle w:val="FirstParagraph"/>
       </w:pPr>
       <w:r>
-        <w:t xml:space="preserve">El valor de trigo exportado desde Tebailandia en 1990 es de</w:t>
-      </w:r>
-      <w:r>
-        <w:t xml:space="preserve"> </w:t>
-      </w:r>
-      <w:r>
-        <w:rPr>
-          <w:b/>
-          <w:bCs/>
-        </w:rPr>
-        <w:t xml:space="preserve">2.32 millones de tebos</w:t>
+        <w:t xml:space="preserve">El valor de tomates exportado desde Tebailandia en 1968 es de</w:t>
+      </w:r>
+      <w:r>
+        <w:t xml:space="preserve"> </w:t>
+      </w:r>
+      <w:r>
+        <w:rPr>
+          <w:b/>
+          <w:bCs/>
+        </w:rPr>
+        <w:t xml:space="preserve">14.45 millones de tebos</w:t>
       </w:r>
       <w:r>
         <w:t xml:space="preserve">.</w:t>
@@ -1667,7 +1667,7 @@
         <w:t xml:space="preserve"> </w:t>
       </w:r>
       <w:r>
-        <w:t xml:space="preserve">exsolution: 46.4|5|46.4|0.05|2.32|2.32|0001</w:t>
+        <w:t xml:space="preserve">exsolution: 60.2|24|60.2|0.24|14.45|14.45|0100</w:t>
       </w:r>
       <w:r>
         <w:t xml:space="preserve"> </w:t>

</xml_diff>

<commit_message>
Fix PDF answer labeling in 13.Rmd: Add A),B),C),D) labels for exams2pdf output
- Added LaTeX label redefinition for PDF format to display uppercase letters A), B), C), D) instead of lowercase a), b), c), d)

- Enhanced crear_tabla_portable() function to generate HTML tables with visible borders for all non-LaTeX formats

- Maintained compatibility across exams2html, exams2moodle, and exams2pdf outputs

- Fixed answerlist parsing by collapsing tables to single lines while preserving visual structure

- Verified successful compilation and rendering in all three R-exams output formats
</commit_message>
<xml_diff>
--- a/Lab-Manjaro/ExportacionesGraficosEstadisticaInterpretacion_n3_v1/ExportacionesGraficosEstadisticaInterpretacion_n3_cloze_v1.docx
+++ b/Lab-Manjaro/ExportacionesGraficosEstadisticaInterpretacion_n3_v1/ExportacionesGraficosEstadisticaInterpretacion_n3_cloze_v1.docx
@@ -18,7 +18,7 @@
       <w:r>
         <w:drawing>
           <wp:inline>
-            <wp:extent cx="5334000" cy="3314023"/>
+            <wp:extent cx="5334000" cy="3308430"/>
             <wp:effectExtent b="0" l="0" r="0" t="0"/>
             <wp:docPr descr="" title="" id="21" name="Picture"/>
             <a:graphic>
@@ -39,7 +39,7 @@
                   <pic:spPr bwMode="auto">
                     <a:xfrm>
                       <a:off x="0" y="0"/>
-                      <a:ext cx="5334000" cy="3314023"/>
+                      <a:ext cx="5334000" cy="3308430"/>
                     </a:xfrm>
                     <a:prstGeom prst="rect">
                       <a:avLst/>
@@ -60,7 +60,7 @@
       <w:r>
         <w:drawing>
           <wp:inline>
-            <wp:extent cx="4864608" cy="4309872"/>
+            <wp:extent cx="4596384" cy="4248912"/>
             <wp:effectExtent b="0" l="0" r="0" t="0"/>
             <wp:docPr descr="" title="" id="24" name="Picture"/>
             <a:graphic>
@@ -81,7 +81,7 @@
                   <pic:spPr bwMode="auto">
                     <a:xfrm>
                       <a:off x="0" y="0"/>
-                      <a:ext cx="4864608" cy="4309872"/>
+                      <a:ext cx="4596384" cy="4248912"/>
                     </a:xfrm>
                     <a:prstGeom prst="rect">
                       <a:avLst/>
@@ -131,7 +131,7 @@
         <w:pStyle w:val="BodyText"/>
       </w:pPr>
       <w:r>
-        <w:t xml:space="preserve">Para determinar el valor específico de tomates exportado desde Tebailandia en 1968, resuelva paso a paso combinando información de ambos gráficos:</w:t>
+        <w:t xml:space="preserve">Para determinar el valor específico de lana exportado desde Tebailandia en 1992, resuelva paso a paso combinando información de ambos gráficos:</w:t>
       </w:r>
     </w:p>
     <w:p>
@@ -222,7 +222,7 @@
         <w:pStyle w:val="FirstParagraph"/>
       </w:pPr>
       <w:r>
-        <w:t xml:space="preserve">Observe el primer gráfico. ¿Cuál fue el valor total de exportaciones de Tebailandia en 1968?</w:t>
+        <w:t xml:space="preserve">Observe el primer gráfico. ¿Cuál fue el valor total de exportaciones de Tebailandia en 1992?</w:t>
       </w:r>
     </w:p>
     <w:p>
@@ -258,7 +258,7 @@
         <w:pStyle w:val="FirstParagraph"/>
       </w:pPr>
       <w:r>
-        <w:t xml:space="preserve">Observe el segundo gráfico. ¿Qué porcentaje del total de exportaciones corresponde a tomates en 1968?</w:t>
+        <w:t xml:space="preserve">Observe el segundo gráfico. ¿Qué porcentaje del total de exportaciones corresponde a lana en 1992?</w:t>
       </w:r>
     </w:p>
     <w:p>
@@ -294,7 +294,7 @@
         <w:pStyle w:val="FirstParagraph"/>
       </w:pPr>
       <w:r>
-        <w:t xml:space="preserve">Para calcular el valor de tomates, identifique los componentes de la fórmula:</w:t>
+        <w:t xml:space="preserve">Para calcular el valor de lana, identifique los componentes de la fórmula:</w:t>
       </w:r>
     </w:p>
     <w:p>
@@ -302,7 +302,7 @@
         <w:pStyle w:val="BodyText"/>
       </w:pPr>
       <w:r>
-        <w:t xml:space="preserve">Valor de tomates = Valor total × (porcentaje del Paso 2 ÷ 100)</w:t>
+        <w:t xml:space="preserve">Valor de lana = Valor total × (porcentaje del Paso 2 ÷ 100)</w:t>
       </w:r>
     </w:p>
     <w:p>
@@ -380,7 +380,7 @@
         <w:pStyle w:val="FirstParagraph"/>
       </w:pPr>
       <w:r>
-        <w:t xml:space="preserve">Por lo tanto, el valor de tomates exportado en 1968 es:</w:t>
+        <w:t xml:space="preserve">Por lo tanto, el valor de lana exportado en 1992 es:</w:t>
       </w:r>
     </w:p>
     <w:p>
@@ -446,7 +446,7 @@
         </w:numPr>
       </w:pPr>
       <w:r>
-        <w:t xml:space="preserve">Dividir el porcentaje de tomates entre el valor total de exportaciones de 1968.</w:t>
+        <w:t xml:space="preserve">Multiplicar el porcentaje de lana por 100 y dividir entre el valor total de exportaciones.</w:t>
       </w:r>
     </w:p>
     <w:p>
@@ -458,7 +458,7 @@
         </w:numPr>
       </w:pPr>
       <w:r>
-        <w:t xml:space="preserve">Multiplicar el valor total de exportaciones de 1968 por el porcentaje de tomates expresado en forma decimal.</w:t>
+        <w:t xml:space="preserve">Dividir el porcentaje de lana entre el valor total de exportaciones de 1992.</w:t>
       </w:r>
     </w:p>
     <w:p>
@@ -470,7 +470,7 @@
         </w:numPr>
       </w:pPr>
       <w:r>
-        <w:t xml:space="preserve">Multiplicar el porcentaje de tomates por 100 y dividir entre el valor total de exportaciones.</w:t>
+        <w:t xml:space="preserve">Multiplicar el valor total de exportaciones de 1992 por el porcentaje de lana expresado en forma decimal.</w:t>
       </w:r>
     </w:p>
     <w:p>
@@ -482,7 +482,7 @@
         </w:numPr>
       </w:pPr>
       <w:r>
-        <w:t xml:space="preserve">Sumar el valor total de exportaciones de 1968 con el porcentaje de tomates.</w:t>
+        <w:t xml:space="preserve">Sumar el valor total de exportaciones de 1992 con el porcentaje de lana.</w:t>
       </w:r>
     </w:p>
     <w:bookmarkEnd w:id="33"/>
@@ -647,7 +647,7 @@
         <w:t xml:space="preserve"> </w:t>
       </w:r>
       <w:r>
-        <w:t xml:space="preserve">60.2 millones de tebos</w:t>
+        <w:t xml:space="preserve">51.6 millones de tebos</w:t>
       </w:r>
     </w:p>
     <w:p>
@@ -665,7 +665,7 @@
         <w:t xml:space="preserve"> </w:t>
       </w:r>
       <w:r>
-        <w:t xml:space="preserve">La lectura cuidadosa del gráfico de barras muestra que en 1968 las exportaciones totales de Tebailandia fueron exactamente 60.2 millones de tebos.</w:t>
+        <w:t xml:space="preserve">La lectura cuidadosa del gráfico de barras muestra que en 1992 las exportaciones totales de Tebailandia fueron exactamente 51.6 millones de tebos.</w:t>
       </w:r>
     </w:p>
     <w:p>
@@ -689,7 +689,7 @@
         </w:numPr>
       </w:pPr>
       <w:r>
-        <w:t xml:space="preserve">Año 1965: 15.7 millones de tebos</w:t>
+        <w:t xml:space="preserve">Año 1989: 20.3 millones de tebos</w:t>
       </w:r>
     </w:p>
     <w:p>
@@ -701,7 +701,7 @@
         </w:numPr>
       </w:pPr>
       <w:r>
-        <w:t xml:space="preserve">Año 1966: 43.2 millones de tebos</w:t>
+        <w:t xml:space="preserve">Año 1990: 45.9 millones de tebos</w:t>
       </w:r>
     </w:p>
     <w:p>
@@ -713,7 +713,7 @@
         </w:numPr>
       </w:pPr>
       <w:r>
-        <w:t xml:space="preserve">Año 1967: 45.4 millones de tebos</w:t>
+        <w:t xml:space="preserve">Año 1991: 48.4 millones de tebos</w:t>
       </w:r>
     </w:p>
     <w:p>
@@ -725,7 +725,7 @@
         </w:numPr>
       </w:pPr>
       <w:r>
-        <w:t xml:space="preserve">Año 1968: 60.2 millones de tebos ←</w:t>
+        <w:t xml:space="preserve">Año 1992: 51.6 millones de tebos ←</w:t>
       </w:r>
       <w:r>
         <w:t xml:space="preserve"> </w:t>
@@ -747,7 +747,7 @@
         </w:numPr>
       </w:pPr>
       <w:r>
-        <w:t xml:space="preserve">Año 1969: 68.6 millones de tebos</w:t>
+        <w:t xml:space="preserve">Año 1993: 63.4 millones de tebos</w:t>
       </w:r>
     </w:p>
     <w:bookmarkEnd w:id="36"/>
@@ -775,7 +775,7 @@
         <w:t xml:space="preserve"> </w:t>
       </w:r>
       <w:r>
-        <w:t xml:space="preserve">24%</w:t>
+        <w:t xml:space="preserve">5%</w:t>
       </w:r>
     </w:p>
     <w:p>
@@ -793,7 +793,7 @@
         <w:t xml:space="preserve"> </w:t>
       </w:r>
       <w:r>
-        <w:t xml:space="preserve">El gráfico circular muestra que tomates representa exactamente el 24% del total de exportaciones en 1968.</w:t>
+        <w:t xml:space="preserve">El gráfico circular muestra que lana representa exactamente el 5% del total de exportaciones en 1992.</w:t>
       </w:r>
     </w:p>
     <w:p>
@@ -817,7 +817,7 @@
         </w:numPr>
       </w:pPr>
       <w:r>
-        <w:t xml:space="preserve">pepinos: 5%</w:t>
+        <w:t xml:space="preserve">ajo: 6%</w:t>
       </w:r>
     </w:p>
     <w:p>
@@ -829,7 +829,7 @@
         </w:numPr>
       </w:pPr>
       <w:r>
-        <w:t xml:space="preserve">limones: 17%</w:t>
+        <w:t xml:space="preserve">tabaco: 14%</w:t>
       </w:r>
     </w:p>
     <w:p>
@@ -841,7 +841,7 @@
         </w:numPr>
       </w:pPr>
       <w:r>
-        <w:t xml:space="preserve">cerdo: 5%</w:t>
+        <w:t xml:space="preserve">aceitunas: 18%</w:t>
       </w:r>
     </w:p>
     <w:p>
@@ -853,7 +853,7 @@
         </w:numPr>
       </w:pPr>
       <w:r>
-        <w:t xml:space="preserve">lana: 10%</w:t>
+        <w:t xml:space="preserve">celulares: 7%</w:t>
       </w:r>
     </w:p>
     <w:p>
@@ -865,7 +865,19 @@
         </w:numPr>
       </w:pPr>
       <w:r>
-        <w:t xml:space="preserve">tomates: 24% ←</w:t>
+        <w:t xml:space="preserve">sorgo: 17%</w:t>
+      </w:r>
+    </w:p>
+    <w:p>
+      <w:pPr>
+        <w:pStyle w:val="Compact"/>
+        <w:numPr>
+          <w:ilvl w:val="0"/>
+          <w:numId w:val="1009"/>
+        </w:numPr>
+      </w:pPr>
+      <w:r>
+        <w:t xml:space="preserve">lana: 5% ←</w:t>
       </w:r>
       <w:r>
         <w:t xml:space="preserve"> </w:t>
@@ -887,7 +899,7 @@
         </w:numPr>
       </w:pPr>
       <w:r>
-        <w:t xml:space="preserve">oro: 6%</w:t>
+        <w:t xml:space="preserve">limones: 25%</w:t>
       </w:r>
     </w:p>
     <w:p>
@@ -899,19 +911,7 @@
         </w:numPr>
       </w:pPr>
       <w:r>
-        <w:t xml:space="preserve">café: 7%</w:t>
-      </w:r>
-    </w:p>
-    <w:p>
-      <w:pPr>
-        <w:pStyle w:val="Compact"/>
-        <w:numPr>
-          <w:ilvl w:val="0"/>
-          <w:numId w:val="1009"/>
-        </w:numPr>
-      </w:pPr>
-      <w:r>
-        <w:t xml:space="preserve">carne de res: 26%</w:t>
+        <w:t xml:space="preserve">mangos: 7%</w:t>
       </w:r>
     </w:p>
     <w:bookmarkEnd w:id="37"/>
@@ -939,7 +939,7 @@
         <w:t xml:space="preserve"> </w:t>
       </w:r>
       <w:r>
-        <w:t xml:space="preserve">60.2</w:t>
+        <w:t xml:space="preserve">51.6</w:t>
       </w:r>
     </w:p>
     <w:p>
@@ -957,7 +957,7 @@
         <w:t xml:space="preserve"> </w:t>
       </w:r>
       <w:r>
-        <w:t xml:space="preserve">Para calcular el valor de tomates, necesitamos usar el valor total de exportaciones identificado en el Paso 1 como numerador de la fórmula.</w:t>
+        <w:t xml:space="preserve">Para calcular el valor de lana, necesitamos usar el valor total de exportaciones identificado en el Paso 1 como numerador de la fórmula.</w:t>
       </w:r>
     </w:p>
     <w:bookmarkEnd w:id="38"/>
@@ -985,7 +985,7 @@
         <w:t xml:space="preserve"> </w:t>
       </w:r>
       <w:r>
-        <w:t xml:space="preserve">0.2400</w:t>
+        <w:t xml:space="preserve">0.0500</w:t>
       </w:r>
     </w:p>
     <w:p>
@@ -1009,7 +1009,7 @@
         <w:t xml:space="preserve"> </w:t>
       </w:r>
       <w:r>
-        <w:t xml:space="preserve">24% ÷ 100 = 0.2400</w:t>
+        <w:t xml:space="preserve">5% ÷ 100 = 0.0500</w:t>
       </w:r>
     </w:p>
     <w:bookmarkEnd w:id="39"/>
@@ -1037,7 +1037,7 @@
         <w:t xml:space="preserve"> </w:t>
       </w:r>
       <w:r>
-        <w:t xml:space="preserve">14.45</w:t>
+        <w:t xml:space="preserve">2.58</w:t>
       </w:r>
     </w:p>
     <w:p>
@@ -1055,7 +1055,7 @@
         <w:t xml:space="preserve"> </w:t>
       </w:r>
       <w:r>
-        <w:t xml:space="preserve">60.2 × 0.2400 = 14.45</w:t>
+        <w:t xml:space="preserve">51.6 × 0.0500 = 2.58</w:t>
       </w:r>
     </w:p>
     <w:bookmarkEnd w:id="40"/>
@@ -1083,7 +1083,7 @@
         <w:t xml:space="preserve"> </w:t>
       </w:r>
       <w:r>
-        <w:t xml:space="preserve">14.45 millones de tebos</w:t>
+        <w:t xml:space="preserve">2.58 millones de tebos</w:t>
       </w:r>
     </w:p>
     <w:p>
@@ -1107,7 +1107,7 @@
         </w:numPr>
       </w:pPr>
       <w:r>
-        <w:t xml:space="preserve">El resultado (14.45 millones) es menor que el total (60.2 millones), lo cual es lógico ya que representa solo una fracción del total.</w:t>
+        <w:t xml:space="preserve">El resultado (2.58 millones) es menor que el total (51.6 millones), lo cual es lógico ya que representa solo una fracción del total.</w:t>
       </w:r>
     </w:p>
     <w:p>
@@ -1160,7 +1160,7 @@
         <w:t xml:space="preserve">A</w:t>
       </w:r>
       <w:r>
-        <w:t xml:space="preserve">: Dividir el porcentaje de tomates entre el valor total de exportaciones de 1968.</w:t>
+        <w:t xml:space="preserve">: Multiplicar el porcentaje de lana por 100 y dividir entre el valor total de exportaciones.</w:t>
       </w:r>
     </w:p>
     <w:p>
@@ -1179,7 +1179,26 @@
         <w:t xml:space="preserve">B</w:t>
       </w:r>
       <w:r>
-        <w:t xml:space="preserve">: Multiplicar el valor total de exportaciones de 1968 por el porcentaje de tomates expresado en forma decimal. ←</w:t>
+        <w:t xml:space="preserve">: Dividir el porcentaje de lana entre el valor total de exportaciones de 1992.</w:t>
+      </w:r>
+    </w:p>
+    <w:p>
+      <w:pPr>
+        <w:pStyle w:val="Compact"/>
+        <w:numPr>
+          <w:ilvl w:val="0"/>
+          <w:numId w:val="1011"/>
+        </w:numPr>
+      </w:pPr>
+      <w:r>
+        <w:rPr>
+          <w:b/>
+          <w:bCs/>
+        </w:rPr>
+        <w:t xml:space="preserve">C</w:t>
+      </w:r>
+      <w:r>
+        <w:t xml:space="preserve">: Multiplicar el valor total de exportaciones de 1992 por el porcentaje de lana expresado en forma decimal. ←</w:t>
       </w:r>
       <w:r>
         <w:t xml:space="preserve"> </w:t>
@@ -1205,29 +1224,10 @@
           <w:b/>
           <w:bCs/>
         </w:rPr>
-        <w:t xml:space="preserve">C</w:t>
-      </w:r>
-      <w:r>
-        <w:t xml:space="preserve">: Multiplicar el porcentaje de tomates por 100 y dividir entre el valor total de exportaciones.</w:t>
-      </w:r>
-    </w:p>
-    <w:p>
-      <w:pPr>
-        <w:pStyle w:val="Compact"/>
-        <w:numPr>
-          <w:ilvl w:val="0"/>
-          <w:numId w:val="1011"/>
-        </w:numPr>
-      </w:pPr>
-      <w:r>
-        <w:rPr>
-          <w:b/>
-          <w:bCs/>
-        </w:rPr>
         <w:t xml:space="preserve">D</w:t>
       </w:r>
       <w:r>
-        <w:t xml:space="preserve">: Sumar el valor total de exportaciones de 1968 con el porcentaje de tomates.</w:t>
+        <w:t xml:space="preserve">: Sumar el valor total de exportaciones de 1992 con el porcentaje de lana.</w:t>
       </w:r>
     </w:p>
     <w:p>
@@ -1250,7 +1250,7 @@
         <w:t xml:space="preserve">“</w:t>
       </w:r>
       <w:r>
-        <w:t xml:space="preserve">Multiplicar el valor total de exportaciones de 1968 por el porcentaje de tomates expresado en forma decimal.</w:t>
+        <w:t xml:space="preserve">Multiplicar el valor total de exportaciones de 1992 por el porcentaje de lana expresado en forma decimal.</w:t>
       </w:r>
       <w:r>
         <w:t xml:space="preserve">”</w:t>
@@ -1323,7 +1323,7 @@
         </w:numPr>
       </w:pPr>
       <w:r>
-        <w:t xml:space="preserve">Valor total de exportaciones en 1968: 60.2 millones de tebos</w:t>
+        <w:t xml:space="preserve">Valor total de exportaciones en 1992: 51.6 millones de tebos</w:t>
       </w:r>
     </w:p>
     <w:p>
@@ -1335,7 +1335,7 @@
         </w:numPr>
       </w:pPr>
       <w:r>
-        <w:t xml:space="preserve">Porcentaje de tomates: 24%</w:t>
+        <w:t xml:space="preserve">Porcentaje de lana: 5%</w:t>
       </w:r>
     </w:p>
     <w:p>
@@ -1347,7 +1347,7 @@
         </w:numPr>
       </w:pPr>
       <w:r>
-        <w:t xml:space="preserve">Porcentaje en decimal: 0.2400</w:t>
+        <w:t xml:space="preserve">Porcentaje en decimal: 0.0500</w:t>
       </w:r>
     </w:p>
     <w:p>
@@ -1359,7 +1359,7 @@
         </w:numPr>
       </w:pPr>
       <w:r>
-        <w:t xml:space="preserve">Valor final de tomates: 14.45 millones de tebos</w:t>
+        <w:t xml:space="preserve">Valor final de lana: 2.58 millones de tebos</w:t>
       </w:r>
     </w:p>
     <w:p>
@@ -1567,17 +1567,17 @@
         <w:pStyle w:val="FirstParagraph"/>
       </w:pPr>
       <w:r>
-        <w:t xml:space="preserve">El valor de tomates exportado desde Tebailandia en 1968 es de</w:t>
-      </w:r>
-      <w:r>
-        <w:t xml:space="preserve"> </w:t>
-      </w:r>
-      <w:r>
-        <w:rPr>
-          <w:b/>
-          <w:bCs/>
-        </w:rPr>
-        <w:t xml:space="preserve">14.45 millones de tebos</w:t>
+        <w:t xml:space="preserve">El valor de lana exportado desde Tebailandia en 1992 es de</w:t>
+      </w:r>
+      <w:r>
+        <w:t xml:space="preserve"> </w:t>
+      </w:r>
+      <w:r>
+        <w:rPr>
+          <w:b/>
+          <w:bCs/>
+        </w:rPr>
+        <w:t xml:space="preserve">2.58 millones de tebos</w:t>
       </w:r>
       <w:r>
         <w:t xml:space="preserve">.</w:t>
@@ -1667,7 +1667,7 @@
         <w:t xml:space="preserve"> </w:t>
       </w:r>
       <w:r>
-        <w:t xml:space="preserve">exsolution: 60.2|24|60.2|0.24|14.45|14.45|0100</w:t>
+        <w:t xml:space="preserve">exsolution: 51.6|5|51.6|0.05|2.58|2.58|0010</w:t>
       </w:r>
       <w:r>
         <w:t xml:space="preserve"> </w:t>

</xml_diff>